<commit_message>
Cataleg REQ1 complet (21 seccions) i nova ruta de sortida
- ESTRUCTURALS/REQ1.docx: amplia el cataleg a totes les seccions del
  document original (131 items pare, 92 sub-items). Les agrupacions
  grans Instal.lacions i Incendis s'han partit en seccions separades
  (Legalitzacions, Inspeccions inicials, Inspeccions periodiques,
  Evacuacio, Documentacio SP, RIPCI, CTE DB SI) per facilitar la
  seleccio al TreeView. 18 placeholders [CAMP: ...] unics; Grup CAPCA
  i Organ homologacio PAU es reutilitzen entre items.
- GenerarInforme.ps1: el fitxer de sortida es desa a la unitat de
  xarxa configurada (I:\Activitats_Ordenances\...\Informes generats)
  amb format YYYY-MM-DD_<Cataleg>_GIA <id>.docx; cau a una carpeta
  local si la unitat no es accessible. Eliminat un Open duplicat.
</commit_message>
<xml_diff>
--- a/ESTRUCTURALS/REQ1.docx
+++ b/ESTRUCTURALS/REQ1.docx
@@ -27,7 +27,7 @@
     <w:p>
       <w:pPr/>
       <w:r>
-        <w:t>Sanitat. L'activitat està inclosa dins l'Annex del Decret 151/2017, de 17 d'octubre, pel qual s'estableixen els requisits i les garanties tecnicosanitàries comunes dels centres i serveis sanitaris i els procediments per a la seva autorització i registre. S'ha d'obtenir l'Autorització de funcionament (Departament de Salut de la Generalitat de Catalunya).</w:t>
+        <w:t>Sanitat. L'activitat esta inclosa dins l'Annex del Decret 151/2017, de 17 d'octubre, pel qual s'estableixen els requisits i les garanties tecnicosanitaries comunes dels centres i serveis sanitaris i els procediments per a la seva autoritzacio i registre. S'ha d'obtenir l'Autoritzacio de funcionament (Departament de Salut de la Generalitat de Catalunya).</w:t>
       </w:r>
     </w:p>
     <w:p>
@@ -44,13 +44,13 @@
         <w:pStyle w:val="Heading2"/>
       </w:pPr>
       <w:r>
-        <w:t>Educació</w:t>
-      </w:r>
-    </w:p>
-    <w:p>
-      <w:pPr/>
-      <w:r>
-        <w:t>Educació. L'activitat està inclosa dins el Decret 122/2012, de 9 d'octubre, del procediment d'autorització i de comunicació prèvia per a l'obertura de centres educatius privats. S'ha d'obtenir l'Autorització d'obertura de centres educatius privats (Departament d'Educació).</w:t>
+        <w:t>Educacio</w:t>
+      </w:r>
+    </w:p>
+    <w:p>
+      <w:pPr/>
+      <w:r>
+        <w:t>Educacio. L'activitat esta inclosa dins el Decret 122/2012, de 9 d'octubre, del procediment d'autoritzacio i de comunicacio previa per a l'obertura de centres educatius privats. S'ha d'obtenir l'Autoritzacio d'obertura de centres educatius privats (Departament d'Educacio).</w:t>
       </w:r>
     </w:p>
     <w:p>
@@ -67,13 +67,13 @@
         <w:pStyle w:val="Heading2"/>
       </w:pPr>
       <w:r>
-        <w:t>Comerç</w:t>
-      </w:r>
-    </w:p>
-    <w:p>
-      <w:pPr/>
-      <w:r>
-        <w:t>Comerç. L'activitat està inclosa dins el Decret Llei 1/2009, del 22 de desembre, d'ordenació dels equipaments comercials. S'ha d'obtenir la llicència comercial d'implantació d'un establiment comercial (Departament d'Empresa i Treball).</w:t>
+        <w:t>Comerc</w:t>
+      </w:r>
+    </w:p>
+    <w:p>
+      <w:pPr/>
+      <w:r>
+        <w:t>Comerc. L'activitat esta inclosa dins el Decret Llei 1/2009, del 22 de desembre, d'ordenacio dels equipaments comercials. S'ha d'obtenir la llicencia comercial d'implantacio d'un establiment comercial (Departament d'Empresa i Treball).</w:t>
       </w:r>
     </w:p>
     <w:p>
@@ -96,7 +96,7 @@
     <w:p>
       <w:pPr/>
       <w:r>
-        <w:t>Esport. L'activitat està inclosa dins el DECRET LEGISLATIU 1/2000, de 31 de juliol, pel qual s'aprova el Text únic de la Llei de l'esport. S'ha d'haver iniciat el tràmit per obtenir l'informe previ de les actuacions en instal·lacions esportives (Consell Català de l'Esport).</w:t>
+        <w:t>Esport. L'activitat esta inclosa dins el DECRET LEGISLATIU 1/2000, de 31 de juliol, pel qual s'aprova el Text unic de la Llei de l'esport. S'ha d'haver iniciat el tramit per obtenir l'informe previ de les actuacions en instal.lacions esportives (Consell Catala de l'Esport).</w:t>
       </w:r>
     </w:p>
     <w:p>
@@ -119,7 +119,7 @@
     <w:p>
       <w:pPr/>
       <w:r>
-        <w:t>Incendis. L'activitat està inclosa dins l'Annex I de la Llei 3/2010, del 18 de febrer, de prevenció i seguretat en matèria d'incendis en establiments, activitats, infraestructures i edificis. S'ha de:</w:t>
+        <w:t>Incendis. L'activitat esta inclosa dins l'Annex I de la Llei 3/2010, del 18 de febrer, de prevencio i seguretat en materia d'incendis en establiments, activitats, infraestructures i edificis. S'ha de:</w:t>
       </w:r>
     </w:p>
     <w:p>
@@ -136,13 +136,13 @@
         <w:pStyle w:val="Heading2"/>
       </w:pPr>
       <w:r>
-        <w:t>::CHILD:: Incendis — informe favorable</w:t>
-      </w:r>
-    </w:p>
-    <w:p>
-      <w:pPr/>
-      <w:r>
-        <w:t>Obtenir l'informe favorable de prevenció i seguretat en matèria d'incendis (Departament d'Interior i Seguretat Pública).</w:t>
+        <w:t>::CHILD:: Incendis - informe favorable</w:t>
+      </w:r>
+    </w:p>
+    <w:p>
+      <w:pPr/>
+      <w:r>
+        <w:t>Obtenir l'informe favorable de prevencio i seguretat en materia d'incendis (Departament d'Interior i Seguretat Publica).</w:t>
       </w:r>
     </w:p>
     <w:p>
@@ -150,13 +150,13 @@
         <w:pStyle w:val="Heading2"/>
       </w:pPr>
       <w:r>
-        <w:t>::CHILD:: Incendis — acta de comprovació</w:t>
-      </w:r>
-    </w:p>
-    <w:p>
-      <w:pPr/>
-      <w:r>
-        <w:t>Presentar l'acta de comprovació per una entitat col·laboradora.</w:t>
+        <w:t>::CHILD:: Incendis - acta de comprovacio</w:t>
+      </w:r>
+    </w:p>
+    <w:p>
+      <w:pPr/>
+      <w:r>
+        <w:t>Presentar l'acta de comprovacio per una entitat col.laboradora.</w:t>
       </w:r>
     </w:p>
     <w:p>
@@ -170,7 +170,7 @@
     <w:p>
       <w:pPr/>
       <w:r>
-        <w:t>Impacte ambiental. L'activitat està inclosa dins l'Article 7 de la Ley 21/2013, de 9 de diciembre, de evaluación ambiental. S'ha de presentar l'estudi d'impacte ambiental a l'ajuntament amb el contingut determinat a l'Annex VI de l'esmentada Llei per obtenir posteriorment l'informe favorable per part de l'OGAU.</w:t>
+        <w:t>Impacte ambiental. L'activitat esta inclosa dins l'Article 7 de la Ley 21/2013, de 9 de diciembre, de evaluacion ambiental. S'ha de presentar l'estudi d'impacte ambiental a l'ajuntament amb el contingut determinat a l'Annex VI de l'esmentada Llei per obtenir posteriorment l'informe favorable per part de l'OGAU.</w:t>
       </w:r>
     </w:p>
     <w:p>
@@ -184,7 +184,7 @@
     <w:p>
       <w:pPr/>
       <w:r>
-        <w:t>Zona inundable fluvial T500. És una activitat crítica situada en zona de perill d'inundació fluvial T500. S'ha d'obtenir l'informe relacionat amb el vector aigua (Agència Catalana de l'Aigua).</w:t>
+        <w:t>Zona inundable fluvial T500. Es una activitat critica situada en zona de perill d'inundacio fluvial T500. S'ha d'obtenir l'informe relacionat amb el vector aigua (Agencia Catalana de l'Aigua).</w:t>
       </w:r>
     </w:p>
     <w:p>
@@ -201,13 +201,13 @@
         <w:pStyle w:val="Heading2"/>
       </w:pPr>
       <w:r>
-        <w:t>Vector Aigua (ACA) — abocaments</w:t>
-      </w:r>
-    </w:p>
-    <w:p>
-      <w:pPr/>
-      <w:r>
-        <w:t>Vector Aigua (ACA). L'activitat està inclosa dins l'Annex VI.1 de la Llei 20/2009, del 4 de desembre, de prevenció i control ambiental de les activitats. S'ha de presentar un projecte tècnic [CAMP: Destinatari projecte (a l'ajuntament (Annex II) / a l'ACA)] amb el contingut determinat a l'Annex III del Decret 130/2003, de 13 de maig, pel qual s'aprova el Reglament dels serveis públics de sanejament per obtenir posteriorment l'autorització d'abocaments d'aigües residuals (Agència Catalana de l'Aigua).</w:t>
+        <w:t>Vector Aigua (ACA) - abocaments</w:t>
+      </w:r>
+    </w:p>
+    <w:p>
+      <w:pPr/>
+      <w:r>
+        <w:t>Vector Aigua (ACA). L'activitat esta inclosa dins l'Annex VI.1 de la Llei 20/2009, del 4 de desembre, de prevencio i control ambiental de les activitats. S'ha de presentar un projecte tecnic [CAMP: Destinatari projecte (a l'ajuntament (Annex II) / a l'ACA)] amb el contingut determinat a l'Annex III del Decret 130/2003, de 13 de maig, pel qual s'aprova el Reglament dels serveis publics de sanejament per obtenir posteriorment l'autoritzacio d'abocaments d'aigues residuals (Agencia Catalana de l'Aigua).</w:t>
       </w:r>
     </w:p>
     <w:p>
@@ -224,13 +224,13 @@
         <w:pStyle w:val="Heading2"/>
       </w:pPr>
       <w:r>
-        <w:t>Vector Aigua (ACA) — DUCA</w:t>
-      </w:r>
-    </w:p>
-    <w:p>
-      <w:pPr/>
-      <w:r>
-        <w:t>Vector Aigua (ACA). L'activitat disposa d'un volum anual d'aigua superior a 1.000 m³, i es troba inclosa en les seccions B, C i D i els grups A032, E360, E383 i J581 de la Classificació catalana d'activitats econòmiques (CCAE-2009). S'ha de presentar la Declaració de l'Ús i la Contaminació de l'Aigua (DUCA).</w:t>
+        <w:t>Vector Aigua (ACA) - DUCA</w:t>
+      </w:r>
+    </w:p>
+    <w:p>
+      <w:pPr/>
+      <w:r>
+        <w:t>Vector Aigua (ACA). L'activitat disposa d'un volum anual d'aigua superior a 1.000 m3, i es troba inclosa en les seccions B, C i D i els grups A032, E360, E383 i J581 de la Classificacio catalana d'activitats economiques (CCAE-2009). S'ha de presentar la Declaracio de l'Us i la Contaminacio de l'Aigua (DUCA).</w:t>
       </w:r>
     </w:p>
     <w:p>
@@ -253,7 +253,7 @@
     <w:p>
       <w:pPr/>
       <w:r>
-        <w:t>Vector Aigua (AMB). L'activitat està inclosa dins l'Article 22 o l'Annex 4 del Reglament Metropolità d'Abocament d'Aigües Residuals (RMAAR, Exp 944/18). S'ha de presentar l'autorització d'abocaments d'aigües (Àrea Metropolitana de Barcelona).</w:t>
+        <w:t>Vector Aigua (AMB). L'activitat esta inclosa dins l'Article 22 o l'Annex 4 del Reglament Metropolita d'Abocament d'Aigues Residuals (RMAAR, Exp 944/18). S'ha de presentar l'autoritzacio d'abocaments d'aigues (Area Metropolitana de Barcelona).</w:t>
       </w:r>
     </w:p>
     <w:p>
@@ -270,13 +270,13 @@
         <w:pStyle w:val="Heading2"/>
       </w:pPr>
       <w:r>
-        <w:t>Vector Residus — projecte tècnic</w:t>
-      </w:r>
-    </w:p>
-    <w:p>
-      <w:pPr/>
-      <w:r>
-        <w:t>Vector Residus. L'activitat està inclosa dins l'Annex VI.2 de la Llei 20/2009, del 4 de desembre, de prevenció i control ambiental de les activitats. S'ha de presentar un projecte tècnic a l'ajuntament amb el contingut determinat a l'Annex IX i X de la Ley 7/2022, de 8 de abril, de residuos y suelos contaminados para una economía circular per obtenir posteriorment l'informe preceptiu favorable (Agència de Residus de Catalunya).</w:t>
+        <w:t>Vector Residus - projecte tecnic</w:t>
+      </w:r>
+    </w:p>
+    <w:p>
+      <w:pPr/>
+      <w:r>
+        <w:t>Vector Residus. L'activitat esta inclosa dins l'Annex VI.2 de la Llei 20/2009, del 4 de desembre, de prevencio i control ambiental de les activitats. S'ha de presentar un projecte tecnic a l'ajuntament amb el contingut determinat a l'Annex IX i X de la Ley 7/2022, de 8 de abril, de residuos y suelos contaminados para una economia circular per obtenir posteriorment l'informe preceptiu favorable (Agencia de Residus de Catalunya).</w:t>
       </w:r>
     </w:p>
     <w:p>
@@ -284,7 +284,7 @@
         <w:pStyle w:val="Heading2"/>
       </w:pPr>
       <w:r>
-        <w:t>Vector Residus — SDR</w:t>
+        <w:t>Vector Residus - SDR</w:t>
       </w:r>
     </w:p>
     <w:p>
@@ -307,13 +307,13 @@
         <w:pStyle w:val="Heading2"/>
       </w:pPr>
       <w:r>
-        <w:t>Vector Atmosfera — Grup A/B</w:t>
-      </w:r>
-    </w:p>
-    <w:p>
-      <w:pPr/>
-      <w:r>
-        <w:t>Vector Atmosfera. Grups A i B. L'activitat està inclosa dins l'Annex VI.3 de la Llei 20/2009, del 4 de desembre, de prevenció i control ambiental de les activitats. S'ha de presentar un projecte tècnic a l'ajuntament amb el contingut mínim determinat a la web de Medi Ambient i Sostenibilitat per obtenir posteriorment l'informe preceptiu favorable (Direcció General de Canvi Climàtic i Qualitat Ambiental). Grup CAPCA: [CAMP: Grup CAPCA].</w:t>
+        <w:t>Vector Atmosfera - Grup A/B</w:t>
+      </w:r>
+    </w:p>
+    <w:p>
+      <w:pPr/>
+      <w:r>
+        <w:t>Vector Atmosfera. Grups A i B. L'activitat esta inclosa dins l'Annex VI.3 de la Llei 20/2009, del 4 de desembre, de prevencio i control ambiental de les activitats. S'ha de presentar un projecte tecnic a l'ajuntament amb el contingut minim determinat a la web de Medi Ambient i Sostenibilitat per obtenir posteriorment l'informe preceptiu favorable (Direccio General de Canvi Climatic i Qualitat Ambiental). Grup CAPCA: [CAMP: Grup CAPCA].</w:t>
       </w:r>
     </w:p>
     <w:p>
@@ -330,13 +330,13 @@
         <w:pStyle w:val="Heading2"/>
       </w:pPr>
       <w:r>
-        <w:t>Vector Atmosfera — Grup C llicència</w:t>
-      </w:r>
-    </w:p>
-    <w:p>
-      <w:pPr/>
-      <w:r>
-        <w:t>Vector Atmosfera. Grup C - llicència. Per tal d'emetre un permís ambiental és necessari disposar de la informació imprescindible per poder fixar els límits d'emissió a l'atmosfera i les prescripcions tècniques. S'ha de redactar un document amb el contingut mínim en matèria d'emissions a l'atmosfera dels projectes d'activitats. Grup CAPCA: [CAMP: Grup CAPCA].</w:t>
+        <w:t>Vector Atmosfera - Grup C llicencia</w:t>
+      </w:r>
+    </w:p>
+    <w:p>
+      <w:pPr/>
+      <w:r>
+        <w:t>Vector Atmosfera. Grup C - llicencia. Per tal d'emetre un permis ambiental es necessari disposar de la informacio imprescindible per poder fixar els limits d'emissio a l'atmosfera i les prescripcions tecniques. S'ha de redactar un document amb el contingut minim en materia d'emissions a l'atmosfera dels projectes d'activitats. Grup CAPCA: [CAMP: Grup CAPCA].</w:t>
       </w:r>
     </w:p>
     <w:p>
@@ -353,13 +353,13 @@
         <w:pStyle w:val="Heading2"/>
       </w:pPr>
       <w:r>
-        <w:t>Vector Atmosfera — Grup C comunicació</w:t>
-      </w:r>
-    </w:p>
-    <w:p>
-      <w:pPr/>
-      <w:r>
-        <w:t>Vector Atmosfera. Grup C - comunicació. Segons la Disposició addicional Segona del DECRET 139/2018, de 3 de juliol, sobre els règims d'intervenció ambiental atmosfèrica dels establiments on es desenvolupin activitats potencialment contaminants de l'atmosfera: Els establiments sotmesos per la Llei 20/2009, de 4 de desembre, a comunicació i classificats en el grup C d'acord amb l'article 7 no han de realitzar la notificació d'emissions que estableix l'article 12. No obstant això, aquests establiments estan obligats a presentar, juntament amb la comunicació, una memòria tècnica i un informe de control d'una entitat col·laboradora de l'Administració en matèria de medi ambient, d'acord amb el que estableix l'article 13.2 i 13.3. Grup CAPCA: [CAMP: Grup CAPCA].</w:t>
+        <w:t>Vector Atmosfera - Grup C comunicacio</w:t>
+      </w:r>
+    </w:p>
+    <w:p>
+      <w:pPr/>
+      <w:r>
+        <w:t>Vector Atmosfera. Grup C - comunicacio. Segons la Disposicio addicional Segona del DECRET 139/2018, de 3 de juliol, sobre els regims d'intervencio ambiental atmosferica dels establiments on es desenvolupin activitats potencialment contaminants de l'atmosfera: Els establiments sotmesos per la Llei 20/2009, de 4 de desembre, a comunicacio i classificats en el grup C d'acord amb l'article 7 no han de realitzar la notificacio d'emissions que estableix l'article 12. No obstant aixo, aquests establiments estan obligats a presentar, juntament amb la comunicacio, una memoria tecnica i un informe de control d'una entitat col.laboradora de l'Administracio en materia de medi ambient, d'acord amb el que estableix l'article 13.2 i 13.3. Grup CAPCA: [CAMP: Grup CAPCA].</w:t>
       </w:r>
     </w:p>
     <w:p>
@@ -373,7 +373,7 @@
     <w:p>
       <w:pPr/>
       <w:r>
-        <w:t>Soroll. L'activitat està inclosa dins l'Annex I del Decret 112/2010, de 31 d'agost, pel qual s'aprova el Reglament d'espectacles públics i activitats recreatives o és susceptible de generar contaminació acústica per soroll. S'han de presentar les mesures in situ de comprovació de les exigències d'acústica ambiental i de qualitat en l'edificació realitzades per una Entitat de Protecció de la Contaminació Acústica [EC-PCA] segons l'article 9 de l'Ordenança relativa a la intervenció administrativa municipal en les activitats de Cornellà de Llobregat (versió vigent des del 19 de juny de 2025). Les mesures in situ consistiran en comprovar:</w:t>
+        <w:t>Soroll. L'activitat esta inclosa dins l'Annex I del Decret 112/2010, de 31 d'agost, pel qual s'aprova el Reglament d'espectacles publics i activitats recreatives o es susceptible de generar contaminacio acustica per soroll. S'han de presentar les mesures in situ de comprovacio de les exigencies d'acustica ambiental i de qualitat en l'edificacio realitzades per una Entitat de Proteccio de la Contaminacio Acustica [EC-PCA] segons l'article 9 de l'Ordenanca relativa a la intervencio administrativa municipal en les activitats de Cornella de Llobregat (versio vigent des del 19 de juny de 2025). Les mesures in situ consistiran en comprovar:</w:t>
       </w:r>
     </w:p>
     <w:p>
@@ -390,13 +390,13 @@
         <w:pStyle w:val="Heading2"/>
       </w:pPr>
       <w:r>
-        <w:t>::CHILD:: Soroll — immissió ambient exterior</w:t>
-      </w:r>
-    </w:p>
-    <w:p>
-      <w:pPr/>
-      <w:r>
-        <w:t>Immissió sonora aplicable a l'ambient exterior.</w:t>
+        <w:t>::CHILD:: Soroll - immissio ambient exterior</w:t>
+      </w:r>
+    </w:p>
+    <w:p>
+      <w:pPr/>
+      <w:r>
+        <w:t>Immissio sonora aplicable a l'ambient exterior.</w:t>
       </w:r>
     </w:p>
     <w:p>
@@ -404,13 +404,13 @@
         <w:pStyle w:val="Heading2"/>
       </w:pPr>
       <w:r>
-        <w:t>::CHILD:: Soroll — immissió ambient interior</w:t>
-      </w:r>
-    </w:p>
-    <w:p>
-      <w:pPr/>
-      <w:r>
-        <w:t>Immissió sonora aplicable a l'ambient interior.</w:t>
+        <w:t>::CHILD:: Soroll - immissio ambient interior</w:t>
+      </w:r>
+    </w:p>
+    <w:p>
+      <w:pPr/>
+      <w:r>
+        <w:t>Immissio sonora aplicable a l'ambient interior.</w:t>
       </w:r>
     </w:p>
     <w:p>
@@ -418,13 +418,13 @@
         <w:pStyle w:val="Heading2"/>
       </w:pPr>
       <w:r>
-        <w:t>::CHILD:: Soroll — vibracions</w:t>
-      </w:r>
-    </w:p>
-    <w:p>
-      <w:pPr/>
-      <w:r>
-        <w:t>Immissió de les vibracions als interiors dels edificis.</w:t>
+        <w:t>::CHILD:: Soroll - vibracions</w:t>
+      </w:r>
+    </w:p>
+    <w:p>
+      <w:pPr/>
+      <w:r>
+        <w:t>Immissio de les vibracions als interiors dels edificis.</w:t>
       </w:r>
     </w:p>
     <w:p>
@@ -438,7 +438,7 @@
     <w:p>
       <w:pPr/>
       <w:r>
-        <w:t>Olors. S'ha de presentar un estudi d'avaluació de l'impacte odorífer de l'activitat sobre l'entorn. S'han de quantificar els nivells d'olors en immissió i avaluar-los mitjançant els valors límit d'immissió de l'Annex II del model d'Ordenança tipus reguladora de la contaminació odorífera de la Diputació de Barcelona.</w:t>
+        <w:t>Olors. S'ha de presentar un estudi d'avaluacio de l'impacte odorifer de l'activitat sobre l'entorn. S'han de quantificar els nivells d'olors en immissio i avaluar-los mitjancant els valors limit d'immissio de l'Annex II del model d'Ordenanca tipus reguladora de la contaminacio odorifera de la Diputacio de Barcelona.</w:t>
       </w:r>
     </w:p>
     <w:p>
@@ -446,13 +446,13 @@
         <w:pStyle w:val="Heading2"/>
       </w:pPr>
       <w:r>
-        <w:t>Vector Sòl</w:t>
-      </w:r>
-    </w:p>
-    <w:p>
-      <w:pPr/>
-      <w:r>
-        <w:t>Vector Sòl. L'activitat està inclosa dins l'Annex I del Real Decreto 9/2005, de 14 de enero, por el que se establece la relación de actividades potencialmente contaminantes del suelo y los criterios y estándares para la declaración de suelos contaminados. S'ha de presentar l'informe preliminar de situació del sòl amb el contingut mínim determinat a l'Annex II de l'esmentat Real Decret. També s'haurà d'entregar un informe de situació en els següents casos:</w:t>
+        <w:t>Vector Sol</w:t>
+      </w:r>
+    </w:p>
+    <w:p>
+      <w:pPr/>
+      <w:r>
+        <w:t>Vector Sol. L'activitat esta inclosa dins l'Annex I del Real Decreto 9/2005, de 14 de enero, por el que se establece la relacion de actividades potencialmente contaminantes del suelo y los criterios y estandares para la declaracion de suelos contaminados. S'ha de presentar l'informe preliminar de situacio del sol amb el contingut minim determinat a l'Annex II de l'esmentat Real Decret. Tambe s'haura d'entregar un informe de situacio en els seguents casos:</w:t>
       </w:r>
     </w:p>
     <w:p>
@@ -460,13 +460,13 @@
         <w:pStyle w:val="Heading2"/>
       </w:pPr>
       <w:r>
-        <w:t>::CHILD:: Vector Sòl — canvi substancial</w:t>
-      </w:r>
-    </w:p>
-    <w:p>
-      <w:pPr/>
-      <w:r>
-        <w:t>Quan s'ha realitzat un canvi substancial en l'activitat i/o instal·lacions.</w:t>
+        <w:t>::CHILD:: Vector Sol - canvi substancial</w:t>
+      </w:r>
+    </w:p>
+    <w:p>
+      <w:pPr/>
+      <w:r>
+        <w:t>Quan s'ha realitzat un canvi substancial en l'activitat i/o instal.lacions.</w:t>
       </w:r>
     </w:p>
     <w:p>
@@ -474,7 +474,7 @@
         <w:pStyle w:val="Heading2"/>
       </w:pPr>
       <w:r>
-        <w:t>::CHILD:: Vector Sòl — cessament</w:t>
+        <w:t>::CHILD:: Vector Sol - cessament</w:t>
       </w:r>
     </w:p>
     <w:p>
@@ -488,13 +488,13 @@
         <w:pStyle w:val="Heading2"/>
       </w:pPr>
       <w:r>
-        <w:t>::CHILD:: Vector Sòl — substitució activitat</w:t>
-      </w:r>
-    </w:p>
-    <w:p>
-      <w:pPr/>
-      <w:r>
-        <w:t>Quan se sol·licita una activitat no potencialment contaminant del sòl en una situació on abans hi havia una activitat potencialment contaminant del sòl.</w:t>
+        <w:t>::CHILD:: Vector Sol - substitucio activitat</w:t>
+      </w:r>
+    </w:p>
+    <w:p>
+      <w:pPr/>
+      <w:r>
+        <w:t>Quan se sol.licita una activitat no potencialment contaminant del sol en una situacio on abans hi havia una activitat potencialment contaminant del sol.</w:t>
       </w:r>
     </w:p>
     <w:p>
@@ -502,13 +502,13 @@
         <w:pStyle w:val="Heading2"/>
       </w:pPr>
       <w:r>
-        <w:t>::CHILD:: Vector Sòl — canvi d'ús</w:t>
-      </w:r>
-    </w:p>
-    <w:p>
-      <w:pPr/>
-      <w:r>
-        <w:t>Quan hi ha un canvi d'ús del sòl.</w:t>
+        <w:t>::CHILD:: Vector Sol - canvi d'us</w:t>
+      </w:r>
+    </w:p>
+    <w:p>
+      <w:pPr/>
+      <w:r>
+        <w:t>Quan hi ha un canvi d'us del sol.</w:t>
       </w:r>
     </w:p>
     <w:p>
@@ -522,7 +522,7 @@
     <w:p>
       <w:pPr/>
       <w:r>
-        <w:t>Mobilitat. L'activitat està inclosa dins l'Article 3 del Decret 344/2006, de 19 de setembre, de regulació dels estudis d'avaluació de la mobilitat generada. S'ha de presentar l'estudi d'avaluació de la mobilitat generada a l'ajuntament amb el contingut mínim determinat a l'Article 14 de l'esmentat Decret i obtenir l'informe preceptiu favorable de Guàrdia Urbana.</w:t>
+        <w:t>Mobilitat. L'activitat esta inclosa dins l'Article 3 del Decret 344/2006, de 19 de setembre, de regulacio dels estudis d'avaluacio de la mobilitat generada. S'ha de presentar l'estudi d'avaluacio de la mobilitat generada a l'ajuntament amb el contingut minim determinat a l'Article 14 de l'esmentat Decret i obtenir l'informe preceptiu favorable de Guardia Urbana.</w:t>
       </w:r>
     </w:p>
     <w:p>
@@ -530,7 +530,7 @@
         <w:pStyle w:val="Heading1"/>
       </w:pPr>
       <w:r>
-        <w:t>Pla d'Autoprotecció</w:t>
+        <w:t>Pla d'Autoproteccio</w:t>
       </w:r>
     </w:p>
     <w:p>
@@ -544,7 +544,7 @@
     <w:p>
       <w:pPr/>
       <w:r>
-        <w:t>PAU. L'activitat està inclosa dins l'Annex I del Decret 30/2015, de 3 de març, pel qual s'aprova el catàleg d'activitats i centres obligats a adoptar mesures d'autoprotecció i es fixa el contingut d'aquestes mesures. S'ha d'elaborar el Pla d'Autoprotecció amb el contingut mínim determinat a l'Annex II de l'esmentat Decret i obtenir el certificat d'homologació del Pla d'Autoprotecció de [CAMP: Òrgan homologació PAU (Protecció civil de Catalunya / Protecció civil local)].</w:t>
+        <w:t>PAU. L'activitat esta inclosa dins l'Annex I del Decret 30/2015, de 3 de marc, pel qual s'aprova el cataleg d'activitats i centres obligats a adoptar mesures d'autoproteccio i es fixa el contingut d'aquestes mesures. S'ha d'elaborar el Pla d'Autoproteccio amb el contingut minim determinat a l'Annex II de l'esmentat Decret i obtenir el certificat d'homologacio del Pla d'Autoproteccio de [CAMP: Organ homologacio PAU (Proteccio civil de Catalunya / Proteccio civil local)].</w:t>
       </w:r>
     </w:p>
     <w:p>
@@ -569,13 +569,13 @@
         <w:pStyle w:val="Heading2"/>
       </w:pPr>
       <w:r>
-        <w:t>Annex III Llei 20/2009 — control inicial</w:t>
-      </w:r>
-    </w:p>
-    <w:p>
-      <w:pPr/>
-      <w:r>
-        <w:t>Annex III Llei 20/2009. Segons l'article 6 de l'Ordenança relativa a la intervenció administrativa municipal en les activitats de Cornellà de Llobregat s'ha d'entregar una certificació tècnica inicial amb resultat favorable per part d'una Entitat Col·laboradora de l'Administració. El titular queda assabentat que els controls periòdics posteriors s'han d'efectuar cada vuit anys, tal i com s'indica a l'article 7 de la mateixa Ordenança.</w:t>
+        <w:t>Annex III Llei 20/2009 - control inicial</w:t>
+      </w:r>
+    </w:p>
+    <w:p>
+      <w:pPr/>
+      <w:r>
+        <w:t>Annex III Llei 20/2009. Segons l'article 6 de l'Ordenanca relativa a la intervencio administrativa municipal en les activitats de Cornella de Llobregat s'ha d'entregar una certificacio tecnica inicial amb resultat favorable per part d'una Entitat Col.laboradora de l'Administracio. El titular queda assabentat que els controls periodics posteriors s'han d'efectuar cada vuit anys, tal i com s'indica a l'article 7 de la mateixa Ordenanca.</w:t>
       </w:r>
     </w:p>
     <w:p>
@@ -583,13 +583,13 @@
         <w:pStyle w:val="Heading2"/>
       </w:pPr>
       <w:r>
-        <w:t>Annex II Llei 20/2009 — control inicial</w:t>
-      </w:r>
-    </w:p>
-    <w:p>
-      <w:pPr/>
-      <w:r>
-        <w:t>Annex II Llei 20/2009. L'activitat es troba regulada pel LLEI 20/2009, del 4 de desembre, de prevenció i control ambiental de les activitats. S'ha de realitzar un control inicial amb resultat favorable per part d'una Entitat Col·laboradora de l'Administració, com s'indica a l'Article 69 de la Llei. El titular queda assabentat que els controls periòdics posteriors s'han d'efectuar cada sis anys, tal i com s'indica a l'article 71 de la mateixa Llei.</w:t>
+        <w:t>Annex II Llei 20/2009 - control inicial</w:t>
+      </w:r>
+    </w:p>
+    <w:p>
+      <w:pPr/>
+      <w:r>
+        <w:t>Annex II Llei 20/2009. L'activitat es troba regulada pel LLEI 20/2009, del 4 de desembre, de prevencio i control ambiental de les activitats. S'ha de realitzar un control inicial amb resultat favorable per part d'una Entitat Col.laboradora de l'Administracio, com s'indica a l'Article 69 de la Llei. El titular queda assabentat que els controls periodics posteriors s'han d'efectuar cada sis anys, tal i com s'indica a l'article 71 de la mateixa Llei.</w:t>
       </w:r>
     </w:p>
     <w:p>
@@ -597,13 +597,13 @@
         <w:pStyle w:val="Heading2"/>
       </w:pPr>
       <w:r>
-        <w:t>Vector Atmosfera — control inicial</w:t>
-      </w:r>
-    </w:p>
-    <w:p>
-      <w:pPr/>
-      <w:r>
-        <w:t>Vector Atmosfera. L'activitat està inclosa dins l'Annex IV de la Ley 34/2007, de 15 de noviembre, de calidad del aire y protección de la atmosfera. S'ha d'entregar, per part d'una Entitat de control en l'àmbit sectorial de la prevenció de la contaminació atmosfèrica [EC-A], tal i com s'indica a l'Article 16 del DECRET 139/2018, de 3 de juliol, sobre els règims d'intervenció ambiental atmosfèrica dels establiments on es desenvolupin activitats potencialment contaminants de l'atmosfera:</w:t>
+        <w:t>Vector Atmosfera - control inicial</w:t>
+      </w:r>
+    </w:p>
+    <w:p>
+      <w:pPr/>
+      <w:r>
+        <w:t>Vector Atmosfera. L'activitat esta inclosa dins l'Annex IV de la Ley 34/2007, de 15 de noviembre, de calidad del aire y proteccion de la atmosfera. S'ha d'entregar, per part d'una Entitat de control en l'ambit sectorial de la prevencio de la contaminacio atmosferica [EC-A], tal i com s'indica a l'Article 16 del DECRET 139/2018, de 3 de juliol, sobre els regims d'intervencio ambiental atmosferica dels establiments on es desenvolupin activitats potencialment contaminants de l'atmosfera:</w:t>
       </w:r>
     </w:p>
     <w:p>
@@ -620,13 +620,13 @@
         <w:pStyle w:val="Heading2"/>
       </w:pPr>
       <w:r>
-        <w:t>::CHILD:: Vector Atmosfera (CI) — CAE</w:t>
-      </w:r>
-    </w:p>
-    <w:p>
-      <w:pPr/>
-      <w:r>
-        <w:t>El CAE (Control Atmosfèric de l'Establiment).</w:t>
+        <w:t>::CHILD:: Vector Atmosfera (CI) - CAE</w:t>
+      </w:r>
+    </w:p>
+    <w:p>
+      <w:pPr/>
+      <w:r>
+        <w:t>El CAE (Control Atmosferic de l'Establiment).</w:t>
       </w:r>
     </w:p>
     <w:p>
@@ -634,13 +634,3208 @@
         <w:pStyle w:val="Heading2"/>
       </w:pPr>
       <w:r>
-        <w:t>::CHILD:: Vector Atmosfera (CI) — informe reglamentari</w:t>
+        <w:t>::CHILD:: Vector Atmosfera (CI) - informe reglamentari</w:t>
       </w:r>
     </w:p>
     <w:p>
       <w:pPr/>
       <w:r>
         <w:t>L'informe reglamentari de mesures d'emissions a l'atmosfera.</w:t>
+      </w:r>
+    </w:p>
+    <w:p>
+      <w:pPr>
+        <w:pStyle w:val="Heading1"/>
+      </w:pPr>
+      <w:r>
+        <w:t>Controls periodics</w:t>
+      </w:r>
+    </w:p>
+    <w:p>
+      <w:pPr>
+        <w:pStyle w:val="Heading2"/>
+      </w:pPr>
+      <w:r>
+        <w:t>Decret 112/2010 - control periodic</w:t>
+      </w:r>
+    </w:p>
+    <w:p>
+      <w:pPr/>
+      <w:r>
+        <w:t>Decret 112/2010. L'activitat es troba regulada pel DECRET 112/2010, de 31 d'agost, pel qual s'aprova el Reglament d'espectacles publics i activitats recreatives. S'ha de realitzar un control periodic amb resultat favorable per part d'una Entitat Col.laboradora de l'Administracio conforme l'article 8 de l'Ordenanca relativa a la intervencio administrativa municipal en les activitats de Cornella de Llobregat. El titular queda assabentat que els controls periodics posteriors s'han d'efectuar cada quatre anys, tal i com s'indica a l'article 132 del mateix Decret.</w:t>
+      </w:r>
+    </w:p>
+    <w:p>
+      <w:pPr>
+        <w:pStyle w:val="Heading2"/>
+      </w:pPr>
+      <w:r>
+        <w:t>Annex II Llei 20/2009 - control periodic</w:t>
+      </w:r>
+    </w:p>
+    <w:p>
+      <w:pPr/>
+      <w:r>
+        <w:t>Annex II Llei 20/2009. L'activitat es troba regulada per la LLEI 20/2009, del 4 de desembre, de prevencio i control ambiental de les activitats. S'ha de realitzar un control periodic amb resultat favorable per part d'una Entitat Col.laboradora de l'Administracio. Els controls periodics posteriors s'han d'efectuar cada sis anys, tal i com s'indica a l'article 71 de la mateixa Llei.</w:t>
+      </w:r>
+    </w:p>
+    <w:p>
+      <w:pPr>
+        <w:pStyle w:val="Heading2"/>
+      </w:pPr>
+      <w:r>
+        <w:t>Annex III Llei 20/2009 - control periodic</w:t>
+      </w:r>
+    </w:p>
+    <w:p>
+      <w:pPr/>
+      <w:r>
+        <w:t>Annex III Llei 20/2009. S'ha de realitzar un control periodic amb resultat favorable per part d'una Entitat Col.laboradora de l'Administracio. Els controls periodics posteriors s'han d'efectuar cada vuit anys, tal i com s'indica a l'article 7.1 de l'Ordenanca relativa a la intervencio administrativa municipal en les activitats de Cornella de Llobregat (versio vigent des del 19 de juny de 2025).</w:t>
+      </w:r>
+    </w:p>
+    <w:p>
+      <w:pPr>
+        <w:pStyle w:val="Heading2"/>
+      </w:pPr>
+      <w:r>
+        <w:t>RSCIEI - control periodic</w:t>
+      </w:r>
+    </w:p>
+    <w:p>
+      <w:pPr/>
+      <w:r>
+        <w:t>RSCIEI. L'activitat es troba regulada pel Real Decreto 2267/2004, de 3 de diciembre, por el que se aprueba el Reglamento de seguridad contra incendios en los establecimientos industriales. S'ha de realitzar un control periodic amb resultat favorable per part d'una Entitat de Control habilitada, com s'indica a l'Article 7 del Real Decret. Els controls periodics posteriors s'han d'efectuar cada [CAMP: Periodicitat RSCIEI (anys)] anys, tal i com s'indica a l'Article 7 del mateix Real Decret.</w:t>
+      </w:r>
+    </w:p>
+    <w:p>
+      <w:pPr>
+        <w:pStyle w:val="Heading2"/>
+      </w:pPr>
+      <w:r>
+        <w:t>Vector Atmosfera - control periodic</w:t>
+      </w:r>
+    </w:p>
+    <w:p>
+      <w:pPr/>
+      <w:r>
+        <w:t>Vector Atmosfera. L'activitat esta inclosa dins l'Annex IV de la Ley 34/2007, de 15 de noviembre, de calidad del aire y proteccion de la atmosfera. S'ha d'entregar, per part d'una Entitat de control en l'ambit sectorial de la prevencio de la contaminacio atmosferica [EC-A], tal i com s'indica a l'Article 16 del DECRET 139/2018, de 3 de juliol, sobre els regims d'intervencio ambiental atmosferica dels establiments on es desenvolupin activitats potencialment contaminants de l'atmosfera:</w:t>
+      </w:r>
+    </w:p>
+    <w:p>
+      <w:pPr/>
+      <w:r>
+        <w:rPr>
+          <w:sz w:val="20"/>
+        </w:rPr>
+        <w:t>https://www.gencat.cat/mediamb/oaec/ec_atm_CA.pdf</w:t>
+      </w:r>
+    </w:p>
+    <w:p>
+      <w:pPr>
+        <w:pStyle w:val="Heading2"/>
+      </w:pPr>
+      <w:r>
+        <w:t>::CHILD:: Vector Atmosfera (CP) - CAE</w:t>
+      </w:r>
+    </w:p>
+    <w:p>
+      <w:pPr/>
+      <w:r>
+        <w:t>El CAE (Control Atmosferic de l'Establiment).</w:t>
+      </w:r>
+    </w:p>
+    <w:p>
+      <w:pPr>
+        <w:pStyle w:val="Heading2"/>
+      </w:pPr>
+      <w:r>
+        <w:t>::CHILD:: Vector Atmosfera (CP) - informe reglamentari</w:t>
+      </w:r>
+    </w:p>
+    <w:p>
+      <w:pPr/>
+      <w:r>
+        <w:t>L'informe reglamentari de mesures d'emissions a l'atmosfera.</w:t>
+      </w:r>
+    </w:p>
+    <w:p>
+      <w:pPr>
+        <w:pStyle w:val="Heading2"/>
+      </w:pPr>
+      <w:r>
+        <w:t>PAU - control periodic</w:t>
+      </w:r>
+    </w:p>
+    <w:p>
+      <w:pPr/>
+      <w:r>
+        <w:t>PAU. L'activitat esta inclosa dins l'Annex I del Decret 30/2015, de 3 de marc, pel qual s'aprova el cataleg d'activitats i centres obligats a adoptar mesures d'autoproteccio i es fixa el contingut d'aquestes mesures. S'ha d'elaborar el Pla d'Autoproteccio amb el contingut minim determinat a l'Annex II de l'esmentat Decret i presentar l'informe favorable emes per [CAMP: Organ homologacio PAU (Proteccio civil de Catalunya / Proteccio civil local)].</w:t>
+      </w:r>
+    </w:p>
+    <w:p>
+      <w:pPr/>
+      <w:r>
+        <w:rPr>
+          <w:sz w:val="20"/>
+        </w:rPr>
+        <w:t>https://canalempresa.gencat.cat/ca/02_serveis_per_temes/instal-lacions-i-seguretat/prevencio-accidents/plans-autoproteccio/</w:t>
+      </w:r>
+    </w:p>
+    <w:p>
+      <w:pPr>
+        <w:pStyle w:val="Heading2"/>
+      </w:pPr>
+      <w:r>
+        <w:t>Vector Sol - control periodic</w:t>
+      </w:r>
+    </w:p>
+    <w:p>
+      <w:pPr/>
+      <w:r>
+        <w:t>Vector Sol. L'activitat esta inclosa dins l'Annex I del Real Decreto 9/2005, de 14 de enero, por el que se establece la relacion de actividades potencialmente contaminantes del suelo y los criterios y estandares para la declaracion de suelos contaminados. S'ha de presentar l'informe de situacio periodic coincidint amb el termini de revisio de la llicencia o, en defecte, cada 10 anys.</w:t>
+      </w:r>
+    </w:p>
+    <w:p>
+      <w:pPr>
+        <w:pStyle w:val="Heading1"/>
+      </w:pPr>
+      <w:r>
+        <w:t>Instal.lacions - Legalitzacions</w:t>
+      </w:r>
+    </w:p>
+    <w:p>
+      <w:pPr>
+        <w:pStyle w:val="Heading2"/>
+      </w:pPr>
+      <w:r>
+        <w:t>RITSIC - presentacio</w:t>
+      </w:r>
+    </w:p>
+    <w:p>
+      <w:pPr/>
+      <w:r>
+        <w:t>Segons l'article 4 de l'Ordenanca relativa a la intervencio administrativa municipal en les activitats de Cornella de Llobregat s'ha de presentar el certificat d'inscripcio al Registre d'instal.lacions de Seguretat Industrial de Catalunya (RITSIC) de totes les instal.lacions que conformin l'activitat a nom del titular de l'activitat o el propietari de l'establiment:</w:t>
+      </w:r>
+    </w:p>
+    <w:p>
+      <w:pPr>
+        <w:pStyle w:val="Heading2"/>
+      </w:pPr>
+      <w:r>
+        <w:t>::CHILD:: RITSIC - autoconsum (fotovoltaica)</w:t>
+      </w:r>
+    </w:p>
+    <w:p>
+      <w:pPr/>
+      <w:r>
+        <w:t>Instal.lacio d'autoconsum (fotovoltaica).</w:t>
+      </w:r>
+    </w:p>
+    <w:p>
+      <w:pPr/>
+      <w:r>
+        <w:rPr>
+          <w:sz w:val="20"/>
+        </w:rPr>
+        <w:t>https://canalempresa.gencat.cat/ca/03_sectors_d_activitat/03_energia/Autoconsum/</w:t>
+      </w:r>
+    </w:p>
+    <w:p>
+      <w:pPr>
+        <w:pStyle w:val="Heading2"/>
+      </w:pPr>
+      <w:r>
+        <w:t>::CHILD:: RITSIC - gas combustible (transport/distribucio)</w:t>
+      </w:r>
+    </w:p>
+    <w:p>
+      <w:pPr/>
+      <w:r>
+        <w:t>Instal.lacio de gas. Transport, emmagatzematge, distribucio gas combustible.</w:t>
+      </w:r>
+    </w:p>
+    <w:p>
+      <w:pPr/>
+      <w:r>
+        <w:rPr>
+          <w:sz w:val="20"/>
+        </w:rPr>
+        <w:t>https://canalempresa.gencat.cat/ca/integraciodepartamentaltramit/tramit/PerTemes/Presentacio-de-la-declaracio-responsable-per-a-installacions-de-gasos-combustibles-posada-en-servei-modificacions-i-baixa?moda=1</w:t>
+      </w:r>
+    </w:p>
+    <w:p>
+      <w:pPr>
+        <w:pStyle w:val="Heading2"/>
+      </w:pPr>
+      <w:r>
+        <w:t>::CHILD:: RITSIC - gas receptor i GLP (ITC-ICG 07)</w:t>
+      </w:r>
+    </w:p>
+    <w:p>
+      <w:pPr/>
+      <w:r>
+        <w:t>Instal.lacio de gas. Instal.lacions receptores de gas i emmagatzematge GLP per a consum propi (ITC-ICG 07).</w:t>
+      </w:r>
+    </w:p>
+    <w:p>
+      <w:pPr/>
+      <w:r>
+        <w:rPr>
+          <w:sz w:val="20"/>
+        </w:rPr>
+        <w:t>https://canalempresa.gencat.cat/ca/03_sectors_d_activitat/05_construccio_i_instal_lacions/03_instal_lacions/aigua_gas_i_electricitat/gas/sense_autoritzacio/</w:t>
+      </w:r>
+    </w:p>
+    <w:p>
+      <w:pPr>
+        <w:pStyle w:val="Heading2"/>
+      </w:pPr>
+      <w:r>
+        <w:t>::CHILD:: RITSIC - gas verificacio per unitat</w:t>
+      </w:r>
+    </w:p>
+    <w:p>
+      <w:pPr/>
+      <w:r>
+        <w:t>Instal.lacio de gas (Verificacio per unitat).</w:t>
+      </w:r>
+    </w:p>
+    <w:p>
+      <w:pPr/>
+      <w:r>
+        <w:rPr>
+          <w:sz w:val="20"/>
+        </w:rPr>
+        <w:t>https://empresa.gencat.cat/ca/treb_ambits_actuacio/seguretat-industrial/installacions-industrials/gasos-combustibles/verificacio/</w:t>
+      </w:r>
+    </w:p>
+    <w:p>
+      <w:pPr>
+        <w:pStyle w:val="Heading2"/>
+      </w:pPr>
+      <w:r>
+        <w:t>::CHILD:: RITSIC - electricitat alta tensio</w:t>
+      </w:r>
+    </w:p>
+    <w:p>
+      <w:pPr/>
+      <w:r>
+        <w:t>Instal.lacio d'electricitat. Alta tensio.</w:t>
+      </w:r>
+    </w:p>
+    <w:p>
+      <w:pPr/>
+      <w:r>
+        <w:rPr>
+          <w:sz w:val="20"/>
+        </w:rPr>
+        <w:t>https://canalempresa.gencat.cat/ca/03_sectors_d_activitat/05_construccio_i_instal_lacions/03_instal_lacions/aigua_gas_i_electricitat/electricitat/alta_tensio/</w:t>
+      </w:r>
+    </w:p>
+    <w:p>
+      <w:pPr>
+        <w:pStyle w:val="Heading2"/>
+      </w:pPr>
+      <w:r>
+        <w:t>::CHILD:: RITSIC - baixa tensio</w:t>
+      </w:r>
+    </w:p>
+    <w:p>
+      <w:pPr/>
+      <w:r>
+        <w:t>Instal.lacio de baixa tensio.</w:t>
+      </w:r>
+    </w:p>
+    <w:p>
+      <w:pPr/>
+      <w:r>
+        <w:rPr>
+          <w:sz w:val="20"/>
+        </w:rPr>
+        <w:t>https://canalempresa.gencat.cat/ca/03_sectors_d_activitat/05_construccio_i_instal_lacions/03_instal_lacions/aigua_gas_i_electricitat/electricitat/baixa_tensio/</w:t>
+      </w:r>
+    </w:p>
+    <w:p>
+      <w:pPr>
+        <w:pStyle w:val="Heading2"/>
+      </w:pPr>
+      <w:r>
+        <w:t>::CHILD:: RITSIC - ascensors</w:t>
+      </w:r>
+    </w:p>
+    <w:p>
+      <w:pPr/>
+      <w:r>
+        <w:t>Ascensors.</w:t>
+      </w:r>
+    </w:p>
+    <w:p>
+      <w:pPr/>
+      <w:r>
+        <w:rPr>
+          <w:sz w:val="20"/>
+        </w:rPr>
+        <w:t>https://canalempresa.gencat.cat/ca/03_sectors_d_activitat/05_construccio_i_instal_lacions/03_instal_lacions/ascensors_i_grues/ascensors/</w:t>
+      </w:r>
+    </w:p>
+    <w:p>
+      <w:pPr>
+        <w:pStyle w:val="Heading2"/>
+      </w:pPr>
+      <w:r>
+        <w:t>::CHILD:: RITSIC - instal.lacions termiques</w:t>
+      </w:r>
+    </w:p>
+    <w:p>
+      <w:pPr/>
+      <w:r>
+        <w:t>Instal.lacions termiques en els edificis.</w:t>
+      </w:r>
+    </w:p>
+    <w:p>
+      <w:pPr/>
+      <w:r>
+        <w:rPr>
+          <w:sz w:val="20"/>
+        </w:rPr>
+        <w:t>https://canalempresa.gencat.cat/ca/03_sectors_d_activitat/05_construccio_i_instal_lacions/03_instal_lacions/calefaccio_climatitzacio_i_fred_industrial/installacions_termiques_en_els_edificis/</w:t>
+      </w:r>
+    </w:p>
+    <w:p>
+      <w:pPr>
+        <w:pStyle w:val="Heading2"/>
+      </w:pPr>
+      <w:r>
+        <w:t>::CHILD:: RITSIC - fred industrial</w:t>
+      </w:r>
+    </w:p>
+    <w:p>
+      <w:pPr/>
+      <w:r>
+        <w:t>Instal.lacions de fred industrial.</w:t>
+      </w:r>
+    </w:p>
+    <w:p>
+      <w:pPr/>
+      <w:r>
+        <w:rPr>
+          <w:sz w:val="20"/>
+        </w:rPr>
+        <w:t>https://canalempresa.gencat.cat/ca/03_sectors_d_activitat/05_construccio_i_instal_lacions/03_instal_lacions/calefaccio_climatitzacio_i_fred_industrial/installacions_de_fred_industrial/</w:t>
+      </w:r>
+    </w:p>
+    <w:p>
+      <w:pPr>
+        <w:pStyle w:val="Heading2"/>
+      </w:pPr>
+      <w:r>
+        <w:t>::CHILD:: RITSIC - equips a pressio</w:t>
+      </w:r>
+    </w:p>
+    <w:p>
+      <w:pPr/>
+      <w:r>
+        <w:t>Equips a pressio.</w:t>
+      </w:r>
+    </w:p>
+    <w:p>
+      <w:pPr/>
+      <w:r>
+        <w:rPr>
+          <w:sz w:val="20"/>
+        </w:rPr>
+        <w:t>https://canalempresa.gencat.cat/ca/03_sectors_d_activitat/05_construccio_i_instal_lacions/03_instal_lacions/equips_a_pressio/</w:t>
+      </w:r>
+    </w:p>
+    <w:p>
+      <w:pPr>
+        <w:pStyle w:val="Heading2"/>
+      </w:pPr>
+      <w:r>
+        <w:t>::CHILD:: RITSIC - PCI</w:t>
+      </w:r>
+    </w:p>
+    <w:p>
+      <w:pPr/>
+      <w:r>
+        <w:t>Instal.lacions de proteccio contra incendis PCI.</w:t>
+      </w:r>
+    </w:p>
+    <w:p>
+      <w:pPr/>
+      <w:r>
+        <w:rPr>
+          <w:sz w:val="20"/>
+        </w:rPr>
+        <w:t>https://canalempresa.gencat.cat/ca/integraciodepartamentaltramit/tramit/PerTemes/Installacions-de-proteccio-contra-incendis</w:t>
+      </w:r>
+    </w:p>
+    <w:p>
+      <w:pPr>
+        <w:pStyle w:val="Heading2"/>
+      </w:pPr>
+      <w:r>
+        <w:t>Emmagatzematge productes quimics - relacio</w:t>
+      </w:r>
+    </w:p>
+    <w:p>
+      <w:pPr/>
+      <w:r>
+        <w:t>Emmagatzematge de productes quimics. S'ha d'entregar una relacio dels maxims productes emmagatzemats on s'indiqui, en una taula, el seguent: Substancia | Classificacio | Classe de perill | Categoria | Indicacio perill | Capacitat d'emmagatzematge. Notes: la Classificacio, Classe de perill i Categoria segueixen l'Annex I del Reglamento (CE) 1272/2008; la Indicacio de perill segueix l'Annex III del mateix Reglament; les unitats son kg per a solids i gasos, litres per a liquids i Nm3 per a gasos comprimits. A partir d'aquesta taula s'haura de justificar:</w:t>
+      </w:r>
+    </w:p>
+    <w:p>
+      <w:pPr>
+        <w:pStyle w:val="Heading2"/>
+      </w:pPr>
+      <w:r>
+        <w:t>::CHILD:: Productes quimics - aplicacio APQ</w:t>
+      </w:r>
+    </w:p>
+    <w:p>
+      <w:pPr/>
+      <w:r>
+        <w:t>L'aplicacio, o no, del Real Decreto 656/2017, de 23 de junio, por el que se aprueba el Reglamento de Almacenamiento de Productos Quimicos y sus Instrucciones Tecnicas Complementarias MIE APQ 0 a 10 segons l'Article 1 i l'Article 2 del mateix reglament.</w:t>
+      </w:r>
+    </w:p>
+    <w:p>
+      <w:pPr/>
+      <w:r>
+        <w:rPr>
+          <w:sz w:val="20"/>
+        </w:rPr>
+        <w:t>https://canalempresa.gencat.cat/ca/03_sectors_d_activitat/05_construccio_i_instal_lacions/03_instal_lacions/productes_quimics_petrolifers/productes-quimics/</w:t>
+      </w:r>
+    </w:p>
+    <w:p>
+      <w:pPr>
+        <w:pStyle w:val="Heading2"/>
+      </w:pPr>
+      <w:r>
+        <w:t>::CHILD:: Productes quimics - accidents greus (Seveso)</w:t>
+      </w:r>
+    </w:p>
+    <w:p>
+      <w:pPr/>
+      <w:r>
+        <w:t>L'aplicacio, o no, del Real Decreto 840/2015, de 21 de septiembre, por el que se aprueban medidas de control de los riesgos inherentes a los accidentes graves en los que intervengan sustancias peligrosas.</w:t>
+      </w:r>
+    </w:p>
+    <w:p>
+      <w:pPr/>
+      <w:r>
+        <w:rPr>
+          <w:sz w:val="20"/>
+        </w:rPr>
+        <w:t>https://canalempresa.gencat.cat/ca/integraciodepartamentaltramit/tramit/PerTemes/Establiments-afectats-per-la-normativa-daccidents-greus?category=74c8c94c-a82c-11e3-a972-000c29052e2c</w:t>
+      </w:r>
+    </w:p>
+    <w:p>
+      <w:pPr>
+        <w:pStyle w:val="Heading2"/>
+      </w:pPr>
+      <w:r>
+        <w:t>::CHILD:: Petrolifera - ITC MI-IP 02 (parc emmagatzematge)</w:t>
+      </w:r>
+    </w:p>
+    <w:p>
+      <w:pPr/>
+      <w:r>
+        <w:t>Instal.lacio petrolifera. ITC MI-IP 02 Parques de almacenamiento de liquidos petroliferos.</w:t>
+      </w:r>
+    </w:p>
+    <w:p>
+      <w:pPr/>
+      <w:r>
+        <w:rPr>
+          <w:sz w:val="20"/>
+        </w:rPr>
+        <w:t>https://canalempresa.gencat.cat/ca/03_sectors_d_activitat/05_construccio_i_instal_lacions/03_instal_lacions/productes_quimics_petrolifers/installacio-emmagatzematge-carburants-combustibles-liquids-benzineres/</w:t>
+      </w:r>
+    </w:p>
+    <w:p>
+      <w:pPr>
+        <w:pStyle w:val="Heading2"/>
+      </w:pPr>
+      <w:r>
+        <w:t>::CHILD:: Petrolifera - ITC MI-IP 03 (us propi)</w:t>
+      </w:r>
+    </w:p>
+    <w:p>
+      <w:pPr/>
+      <w:r>
+        <w:t>Instal.lacio petrolifera. ITC MI-IP 03 Instalaciones petroliferas para uso propio.</w:t>
+      </w:r>
+    </w:p>
+    <w:p>
+      <w:pPr/>
+      <w:r>
+        <w:rPr>
+          <w:sz w:val="20"/>
+        </w:rPr>
+        <w:t>https://canalempresa.gencat.cat/ca/03_sectors_d_activitat/05_construccio_i_instal_lacions/03_instal_lacions/productes_quimics_petrolifers/productes-petrolifers-consum-propia-installacio/</w:t>
+      </w:r>
+    </w:p>
+    <w:p>
+      <w:pPr>
+        <w:pStyle w:val="Heading2"/>
+      </w:pPr>
+      <w:r>
+        <w:t>::CHILD:: Petrolifera - ITC MI-IP 04 (subministre vehicles)</w:t>
+      </w:r>
+    </w:p>
+    <w:p>
+      <w:pPr/>
+      <w:r>
+        <w:t>Instal.lacio petrolifera. ITC MI-IP 04 Instalaciones para suministro a vehiculos.</w:t>
+      </w:r>
+    </w:p>
+    <w:p>
+      <w:pPr/>
+      <w:r>
+        <w:rPr>
+          <w:sz w:val="20"/>
+        </w:rPr>
+        <w:t>https://canalempresa.gencat.cat/ca/03_sectors_d_activitat/05_construccio_i_instal_lacions/03_instal_lacions/productes_quimics_petrolifers/installacio-emmagatzematge-carburants-combustibles-liquids-benzineres/</w:t>
+      </w:r>
+    </w:p>
+    <w:p>
+      <w:pPr>
+        <w:pStyle w:val="Heading2"/>
+      </w:pPr>
+      <w:r>
+        <w:t>::CHILD:: Instal.lacions radioactives</w:t>
+      </w:r>
+    </w:p>
+    <w:p>
+      <w:pPr/>
+      <w:r>
+        <w:t>Instal.lacions radioactives.</w:t>
+      </w:r>
+    </w:p>
+    <w:p>
+      <w:pPr/>
+      <w:r>
+        <w:rPr>
+          <w:sz w:val="20"/>
+        </w:rPr>
+        <w:t>https://canalempresa.gencat.cat/ca/integraciodepartamentaltramit/tramit/PerTemes/Autoritzacio-dinstallacions-radioactives</w:t>
+      </w:r>
+    </w:p>
+    <w:p>
+      <w:pPr>
+        <w:pStyle w:val="Heading2"/>
+      </w:pPr>
+      <w:r>
+        <w:t>::CHILD:: Raigs X (medic/veterinari)</w:t>
+      </w:r>
+    </w:p>
+    <w:p>
+      <w:pPr/>
+      <w:r>
+        <w:t>Instal.lacions de raigs X per a usos medics i veterinaris.</w:t>
+      </w:r>
+    </w:p>
+    <w:p>
+      <w:pPr/>
+      <w:r>
+        <w:rPr>
+          <w:sz w:val="20"/>
+        </w:rPr>
+        <w:t>https://canalempresa.gencat.cat/ca/integraciodepartamentaltramit/tramit/PerTemes/Registre-dinstallacions-de-raigs-X-per-a-usos-medics-i-veterinaris</w:t>
+      </w:r>
+    </w:p>
+    <w:p>
+      <w:pPr>
+        <w:pStyle w:val="Heading1"/>
+      </w:pPr>
+      <w:r>
+        <w:t>Instal.lacions - Inspeccions inicials</w:t>
+      </w:r>
+    </w:p>
+    <w:p>
+      <w:pPr>
+        <w:pStyle w:val="Heading2"/>
+      </w:pPr>
+      <w:r>
+        <w:t>Insp. inicial - fotovoltaica &gt;25 kW</w:t>
+      </w:r>
+    </w:p>
+    <w:p>
+      <w:pPr/>
+      <w:r>
+        <w:t>Instal.lacio fotovoltaica &gt;25 kW. L'activitat esta inclosa dins l'apartat 4.1 de la ITC-BT-05 VERIFICACIONES E INSPECCIONES del Real Decreto 842/2002, de 2 de agosto, por el que se aprueba el Reglamento electrotecnico para baja tension. S'ha de presentar la inspeccio inicial de la instal.lacio fotovoltaica per part d'un organisme de control habilitat.</w:t>
+      </w:r>
+    </w:p>
+    <w:p>
+      <w:pPr>
+        <w:pStyle w:val="Heading2"/>
+      </w:pPr>
+      <w:r>
+        <w:t>Insp. inicial - gas</w:t>
+      </w:r>
+    </w:p>
+    <w:p>
+      <w:pPr/>
+      <w:r>
+        <w:t>Gas. L'activitat esta inclosa dins l'article 2 del Real Decreto 919/2006, de 28 de julio, por el que se aprueba el Reglamento tecnico de distribucion y utilizacion de combustibles gaseosos y sus instrucciones tecnicas complementarias ICG 01 a 11. S'ha de presentar la inspeccio inicial de gas per una empresa instal.ladora de gas.</w:t>
+      </w:r>
+    </w:p>
+    <w:p>
+      <w:pPr>
+        <w:pStyle w:val="Heading2"/>
+      </w:pPr>
+      <w:r>
+        <w:t>Insp. inicial - alta tensio</w:t>
+      </w:r>
+    </w:p>
+    <w:p>
+      <w:pPr/>
+      <w:r>
+        <w:t>Alta Tensio. L'activitat te una potencia superior a 30 kV per tant esta inclosa dins l'apartat 3 de la INSTRUCCION TECNICA COMPLEMENTARIA ITC-RAT 23 del Real Decreto 337/2014, de 9 de mayo, por el que se aprueban el Reglamento sobre condiciones tecnicas y garantias de seguridad en instalaciones electricas de alta tension y sus Instrucciones Tecnicas Complementarias ITC-RAT 01 a 23. S'ha de presentar la inspeccio inicial d'Alta Tensio per part d'un organisme de control habilitat.</w:t>
+      </w:r>
+    </w:p>
+    <w:p>
+      <w:pPr>
+        <w:pStyle w:val="Heading2"/>
+      </w:pPr>
+      <w:r>
+        <w:t>Insp. inicial - baixa tensio</w:t>
+      </w:r>
+    </w:p>
+    <w:p>
+      <w:pPr/>
+      <w:r>
+        <w:t>Baixa Tensio. L'activitat esta inclosa dins l'apartat 4.1 de la ITC-BT-05 VERIFICACIONES E INSPECCIONES del Real Decreto 842/2002, de 2 de agosto, por el que se aprueba el Reglamento electrotecnico para baja tension. S'ha de presentar la inspeccio inicial de Baixa Tensio per part d'un organisme de control habilitat.</w:t>
+      </w:r>
+    </w:p>
+    <w:p>
+      <w:pPr>
+        <w:pStyle w:val="Heading2"/>
+      </w:pPr>
+      <w:r>
+        <w:t>Insp. inicial - ascensors</w:t>
+      </w:r>
+    </w:p>
+    <w:p>
+      <w:pPr/>
+      <w:r>
+        <w:t>Ascensors. L'activitat esta inclosa dins l'article 1 de Real Decreto 355/2024, de 2 de abril, por el que se aprueba la Instruccion Tecnica Complementaria ITC AEM 1 «Ascensores». S'ha de presentar la inspeccio inicial de l'ascensor o ascensors per part d'un organisme de control habilitat.</w:t>
+      </w:r>
+    </w:p>
+    <w:p>
+      <w:pPr>
+        <w:pStyle w:val="Heading1"/>
+      </w:pPr>
+      <w:r>
+        <w:t>Instal.lacions - Inspeccions periodiques</w:t>
+      </w:r>
+    </w:p>
+    <w:p>
+      <w:pPr>
+        <w:pStyle w:val="Heading2"/>
+      </w:pPr>
+      <w:r>
+        <w:t>Insp. periodica - fotovoltaica &gt;25 kW (5 anys)</w:t>
+      </w:r>
+    </w:p>
+    <w:p>
+      <w:pPr/>
+      <w:r>
+        <w:t>Instal.lacio fotovoltaica &gt;25 kW. L'activitat esta inclosa dins l'apartat 4.1 de la ITC-BT-05 VERIFICACIONES E INSPECCIONES del Real Decreto 842/2002, de 2 de agosto, por el que se aprueba el Reglamento electrotecnico para baja tension. S'ha de presentar la inspeccio periodica de la instal.lacio fotovoltaica per part d'un organisme de control habilitat (vigencia 5 anys).</w:t>
+      </w:r>
+    </w:p>
+    <w:p>
+      <w:pPr>
+        <w:pStyle w:val="Heading2"/>
+      </w:pPr>
+      <w:r>
+        <w:t>Insp. periodica - gas (5 anys)</w:t>
+      </w:r>
+    </w:p>
+    <w:p>
+      <w:pPr/>
+      <w:r>
+        <w:t>Gas. L'activitat esta inclosa dins l'article 2 del Real Decreto 919/2006, de 28 de julio, por el que se aprueba el Reglamento tecnico de distribucion y utilizacion de combustibles gaseosos y sus instrucciones tecnicas complementarias ICG 01 a 11. S'ha de presentar la inspeccio periodica de gas per una empresa instal.ladora de gas (vigencia 5 anys).</w:t>
+      </w:r>
+    </w:p>
+    <w:p>
+      <w:pPr>
+        <w:pStyle w:val="Heading2"/>
+      </w:pPr>
+      <w:r>
+        <w:t>Insp. periodica - alta tensio (3 anys)</w:t>
+      </w:r>
+    </w:p>
+    <w:p>
+      <w:pPr/>
+      <w:r>
+        <w:t>Alta Tensio. L'activitat te una potencia superior a 30 kV per tant esta inclosa dins l'apartat 3 de la INSTRUCCION TECNICA COMPLEMENTARIA ITC-RAT 23 del Real Decreto 337/2014, de 9 de mayo, por el que se aprueban el Reglamento sobre condiciones tecnicas y garantias de seguridad en instalaciones electricas de alta tension y sus Instrucciones Tecnicas Complementarias ITC-RAT 01 a 23. S'ha de presentar la inspeccio periodica d'Alta Tensio per part d'un organisme de control habilitat (vigencia 3 anys).</w:t>
+      </w:r>
+    </w:p>
+    <w:p>
+      <w:pPr>
+        <w:pStyle w:val="Heading2"/>
+      </w:pPr>
+      <w:r>
+        <w:t>Insp. periodica - baixa tensio (5 anys)</w:t>
+      </w:r>
+    </w:p>
+    <w:p>
+      <w:pPr/>
+      <w:r>
+        <w:t>Baixa Tensio. L'activitat esta inclosa dins l'apartat 4.1 de la ITC-BT-05 VERIFICACIONES E INSPECCIONES del Real Decreto 842/2002, de 2 de agosto, por el que se aprueba el Reglamento electrotecnico para baja tension. S'ha de presentar la inspeccio periodica de Baixa Tensio per part d'un organisme de control habilitat (vigencia 5 anys).</w:t>
+      </w:r>
+    </w:p>
+    <w:p>
+      <w:pPr>
+        <w:pStyle w:val="Heading2"/>
+      </w:pPr>
+      <w:r>
+        <w:t>Insp. periodica - ascensors</w:t>
+      </w:r>
+    </w:p>
+    <w:p>
+      <w:pPr/>
+      <w:r>
+        <w:t>Ascensors. L'activitat esta inclosa dins l'article 1 de Real Decreto 355/2024, de 2 de abril, por el que se aprueba la Instruccion Tecnica Complementaria ITC AEM 1 «Ascensores». S'ha de presentar la inspeccio periodica de l'ascensor o ascensors per part d'un organisme de control habilitat (vigencia de 2 anys en us industrial i publica concurrencia, 4 anys en mes de 20 habitatges o 4 plantes, 6 anys de vigencia la resta de casos).</w:t>
+      </w:r>
+    </w:p>
+    <w:p>
+      <w:pPr>
+        <w:pStyle w:val="Heading2"/>
+      </w:pPr>
+      <w:r>
+        <w:t>Insp. periodica - termiques</w:t>
+      </w:r>
+    </w:p>
+    <w:p>
+      <w:pPr/>
+      <w:r>
+        <w:t>Instal.lacions termiques. L'activitat esta inclosa dins l'article 4.2 de la INSTRUCCION TECNICA IT 4. INSPECCION del Real Decreto 1027/2007, de 20 de julio, por el que se aprueba el Reglamento de Instalaciones Termicas en los Edificios. S'ha de presentar la inspeccio periodica de la instal.lacio termica per part d'un organisme de control habilitat (vigencia [CAMP: Periodicitat termiques (anys)] anys).</w:t>
+      </w:r>
+    </w:p>
+    <w:p>
+      <w:pPr>
+        <w:pStyle w:val="Heading2"/>
+      </w:pPr>
+      <w:r>
+        <w:t>Insp. periodica - fred industrial (10 anys)</w:t>
+      </w:r>
+    </w:p>
+    <w:p>
+      <w:pPr/>
+      <w:r>
+        <w:t>Instal.lacions de fred industrial. L'activitat esta inclosa dins l'article 3 de la INSTRUCCION IF-14 del Real Decreto 552/2019, de 27 de septiembre, por el que se aprueban el Reglamento de seguridad para instalaciones frigorificas y sus instrucciones tecnicas complementarias. S'ha de presentar la inspeccio periodica de la instal.lacio de fred industrial per part d'un organisme de control habilitat (vigencia 10 anys).</w:t>
+      </w:r>
+    </w:p>
+    <w:p>
+      <w:pPr>
+        <w:pStyle w:val="Heading2"/>
+      </w:pPr>
+      <w:r>
+        <w:t>Insp. periodica - equips a pressio (10 anys)</w:t>
+      </w:r>
+    </w:p>
+    <w:p>
+      <w:pPr/>
+      <w:r>
+        <w:t>Equips a pressio. L'activitat esta inclosa dins el Real Decreto 809/2021, de 21 de septiembre, por el que se aprueba el Reglamento de equipos a presion y sus instrucciones tecnicas complementarias. S'ha de presentar la inspeccio periodica de l'equip a pressio per part d'un organisme de control habilitat (vigencia 10 anys).</w:t>
+      </w:r>
+    </w:p>
+    <w:p>
+      <w:pPr>
+        <w:pStyle w:val="Heading2"/>
+      </w:pPr>
+      <w:r>
+        <w:t>Insp. periodica - PCI</w:t>
+      </w:r>
+    </w:p>
+    <w:p>
+      <w:pPr/>
+      <w:r>
+        <w:t>PCI. L'activitat esta inclosa dins el Real Decreto 513/2017, de 22 de mayo, por el que se aprueba el Reglamento de instalaciones de proteccion contra incendios. S'ha de presentar la inspeccio periodica dels elements de proteccio contra incendis per part d'un organisme de control habilitat (vigencia 10 anys). En cas que els elements de proteccio contra incendis estiguin instal.lats fa menys de 10 anys s'ha d'entregar un certificat de l'empresa instal.ladora, emes per un tecnic titulat competent designat per aquesta, en el qual es fara constar que la instal.lacio s'ha realitzat de conformitat amb el que s'estableix en el Real Decret 513/2017 i d'acord amb el projecte o documentacio tecnica.</w:t>
+      </w:r>
+    </w:p>
+    <w:p>
+      <w:pPr>
+        <w:pStyle w:val="Heading2"/>
+      </w:pPr>
+      <w:r>
+        <w:t>Insp. periodica - productes quimics (5 anys)</w:t>
+      </w:r>
+    </w:p>
+    <w:p>
+      <w:pPr/>
+      <w:r>
+        <w:t>Emmagatzematge de productes quimics. L'activitat esta inclosa dins l'Article 1 i 2 del Real Decreto 656/2017, de 23 de junio, por el que se aprueba el Reglamento de Almacenamiento de Productos Quimicos y sus Instrucciones Tecnicas Complementarias MIE APQ 0 a 10. S'ha de presentar la inspeccio periodica de l'emmagatzematge de productes quimics per part d'un organisme de control habilitat (vigencia 5 anys).</w:t>
+      </w:r>
+    </w:p>
+    <w:p>
+      <w:pPr>
+        <w:pStyle w:val="Heading2"/>
+      </w:pPr>
+      <w:r>
+        <w:t>Insp. periodica - petrolifera MI-IP 02 (10 anys)</w:t>
+      </w:r>
+    </w:p>
+    <w:p>
+      <w:pPr/>
+      <w:r>
+        <w:t>Instal.lacio petrolifera. ITC MI-IP 02 Parques de almacenamiento de liquidos petroliferos. L'activitat esta inclosa dins l'Article 2 del Real Decreto 2085/1994, de 20 de octubre, por el que se aprueba el Reglamento de Instalaciones Petroliferas. S'ha de presentar la inspeccio periodica de la instal.lacio petrolifera per part d'un organisme de control habilitat (vigencia 10 anys).</w:t>
+      </w:r>
+    </w:p>
+    <w:p>
+      <w:pPr>
+        <w:pStyle w:val="Heading2"/>
+      </w:pPr>
+      <w:r>
+        <w:t>Insp. periodica - petrolifera MI-IP 03 (10 anys)</w:t>
+      </w:r>
+    </w:p>
+    <w:p>
+      <w:pPr/>
+      <w:r>
+        <w:t>Instal.lacio petrolifera. ITC MI-IP 03 Instalaciones petroliferas para uso propio. L'activitat esta inclosa dins l'Article 2 del Real Decreto 1427/1997, de 15 de septiembre, por el que se aprueba la instruccion tecnica complementaria MI-IP 03 «Instalaciones petroliferas para uso propio». S'ha de presentar la inspeccio periodica de la instal.lacio petrolifera per part d'un organisme de control habilitat (vigencia 10 anys).</w:t>
+      </w:r>
+    </w:p>
+    <w:p>
+      <w:pPr>
+        <w:pStyle w:val="Heading2"/>
+      </w:pPr>
+      <w:r>
+        <w:t>Insp. periodica - petrolifera MI-IP 04 (5 anys)</w:t>
+      </w:r>
+    </w:p>
+    <w:p>
+      <w:pPr/>
+      <w:r>
+        <w:t>Instal.lacio petrolifera. ITC MI-IP 04 Instalaciones para suministro a vehiculos. L'activitat esta inclosa dins del Real Decreto 706/2017, de 7 de julio, por el que se aprueba la instruccion tecnica complementaria MI-IP 04 «Instalaciones para suministro a vehiculos» y se regulan determinados aspectos de la reglamentacion de instalaciones petroliferas. S'ha de presentar la inspeccio periodica de la instal.lacio petrolifera per part d'un organisme de control habilitat (vigencia 5 anys).</w:t>
+      </w:r>
+    </w:p>
+    <w:p>
+      <w:pPr>
+        <w:pStyle w:val="Heading2"/>
+      </w:pPr>
+      <w:r>
+        <w:t>Insp. periodica - raigs X</w:t>
+      </w:r>
+    </w:p>
+    <w:p>
+      <w:pPr/>
+      <w:r>
+        <w:t>Instal.lacions de raigs X. L'activitat esta inclosa dins l'Article 17 del Real Decreto 1085/2009, de 3 de julio, por el que se aprueba el Reglamento sobre instalacion y utilizacion de aparatos de rayos X con fines de diagnostico medico. S'ha de presentar la inspeccio periodica de la instal.lacio de raigs X per part d'un organisme de control habilitat (vigencia [CAMP: Periodicitat raigs X (anys)] anys).</w:t>
+      </w:r>
+    </w:p>
+    <w:p>
+      <w:pPr>
+        <w:pStyle w:val="Heading1"/>
+      </w:pPr>
+      <w:r>
+        <w:t>Registres</w:t>
+      </w:r>
+    </w:p>
+    <w:p>
+      <w:pPr>
+        <w:pStyle w:val="Heading2"/>
+      </w:pPr>
+      <w:r>
+        <w:t>Nucli zoologic</w:t>
+      </w:r>
+    </w:p>
+    <w:p>
+      <w:pPr/>
+      <w:r>
+        <w:t>Nucli zoologic. L'activitat esta inclosa dins el Decret Legislatiu 2/2008, de 15 d'abril, pel qual s'aprova el Text refos de la Llei de proteccio dels animals. S'ha d'inscriure l'activitat en el Registre de nucli zoologic.</w:t>
+      </w:r>
+    </w:p>
+    <w:p>
+      <w:pPr/>
+      <w:r>
+        <w:rPr>
+          <w:sz w:val="20"/>
+        </w:rPr>
+        <w:t>https://territori.gencat.cat/ca/tramits/tramits-temes/Registre-dun-nucli-zoologic</w:t>
+      </w:r>
+    </w:p>
+    <w:p>
+      <w:pPr>
+        <w:pStyle w:val="Heading2"/>
+      </w:pPr>
+      <w:r>
+        <w:t>RASIC</w:t>
+      </w:r>
+    </w:p>
+    <w:p>
+      <w:pPr/>
+      <w:r>
+        <w:t>RASIC. El titular de l'activitat esta inclos dins l'Article 8 de la Llei 9/2014, del 31 de juliol, de la seguretat industrial dels establiments, les instal.lacions i els productes. S'ha de registrar en el seguent enllac:</w:t>
+      </w:r>
+    </w:p>
+    <w:p>
+      <w:pPr/>
+      <w:r>
+        <w:rPr>
+          <w:sz w:val="20"/>
+        </w:rPr>
+        <w:t>https://canalempresa.gencat.cat/ca/integraciodepartamentaltramit/tramit/PerTemes/Empresa-installadora-mantenidora-i-o-reparadora-dinstallacions-industrials</w:t>
+      </w:r>
+    </w:p>
+    <w:p>
+      <w:pPr>
+        <w:pStyle w:val="Heading2"/>
+      </w:pPr>
+      <w:r>
+        <w:t>RASIC - taller mecanic</w:t>
+      </w:r>
+    </w:p>
+    <w:p>
+      <w:pPr/>
+      <w:r>
+        <w:t>RASIC Taller mecanic. El titular de l'activitat esta inclos dins l'Article 8 de la Llei 9/2014, del 31 de juliol, de la seguretat industrial dels establiments, les instal.lacions i els productes. S'ha de registrar en el seguent enllac:</w:t>
+      </w:r>
+    </w:p>
+    <w:p>
+      <w:pPr/>
+      <w:r>
+        <w:rPr>
+          <w:sz w:val="20"/>
+        </w:rPr>
+        <w:t>https://canalempresa.gencat.cat/ca/integraciodepartamentaltramit/tramit/PerTemes/Taller-de-reparacio-de-vehicles-automobils</w:t>
+      </w:r>
+    </w:p>
+    <w:p>
+      <w:pPr>
+        <w:pStyle w:val="Heading2"/>
+      </w:pPr>
+      <w:r>
+        <w:t>Metalls preciosos</w:t>
+      </w:r>
+    </w:p>
+    <w:p>
+      <w:pPr/>
+      <w:r>
+        <w:t>Metalls preciosos. L'activitat es fabricant o importadora d'objectes fabricats amb metalls preciosos. Ha d'estar inscrita en el Registre de fabricants i/o importadors de metalls preciosos.</w:t>
+      </w:r>
+    </w:p>
+    <w:p>
+      <w:pPr/>
+      <w:r>
+        <w:rPr>
+          <w:sz w:val="20"/>
+        </w:rPr>
+        <w:t>https://web.gencat.cat/ca/tramits/tramits-temes/Registre-de-fabricants-i-o-importadors-de-metalls-preciosos</w:t>
+      </w:r>
+    </w:p>
+    <w:p>
+      <w:pPr>
+        <w:pStyle w:val="Heading2"/>
+      </w:pPr>
+      <w:r>
+        <w:t>Productes sanitaris - venda</w:t>
+      </w:r>
+    </w:p>
+    <w:p>
+      <w:pPr/>
+      <w:r>
+        <w:t>Fabricacio, distribucio i venda de productes sanitaris. S'ha de sol.licitar la Comunicacio de l'activitat de venda de productes sanitaris i/o de productes sanitaris per a diagnostic in vitro.</w:t>
+      </w:r>
+    </w:p>
+    <w:p>
+      <w:pPr/>
+      <w:r>
+        <w:rPr>
+          <w:sz w:val="20"/>
+        </w:rPr>
+        <w:t>https://canalempresa.gencat.cat/ca/integraciodepartamentaltramit/tramit/PerTemes/Comunicacio-de-lactivitat-de-venda-de-productes-sanitaris-i-o-de-productes-sanitaris-per-a-diagnostic-in-vitro</w:t>
+      </w:r>
+    </w:p>
+    <w:p>
+      <w:pPr>
+        <w:pStyle w:val="Heading2"/>
+      </w:pPr>
+      <w:r>
+        <w:t>Productes sanitaris - protesis dentals</w:t>
+      </w:r>
+    </w:p>
+    <w:p>
+      <w:pPr/>
+      <w:r>
+        <w:t>Fabricacio, distribucio i venda de productes sanitaris. S'ha de sol.licitar l'Autoritzacio d'empreses fabricants de protesis dentals i altres productes sanitaris dentals a mida.</w:t>
+      </w:r>
+    </w:p>
+    <w:p>
+      <w:pPr/>
+      <w:r>
+        <w:rPr>
+          <w:sz w:val="20"/>
+        </w:rPr>
+        <w:t>https://canalempresa.gencat.cat/ca/integraciodepartamentaltramit/tramit/PerTemes/Autoritzacio-dempreses-fabricants-de-protesis-dentals-i-altres-productes-sanitaris-dentals-a-mida</w:t>
+      </w:r>
+    </w:p>
+    <w:p>
+      <w:pPr>
+        <w:pStyle w:val="Heading2"/>
+      </w:pPr>
+      <w:r>
+        <w:t>Optica - autoritzacio</w:t>
+      </w:r>
+    </w:p>
+    <w:p>
+      <w:pPr/>
+      <w:r>
+        <w:t>Optiques, ortopedies i audioprotesis. S'ha de sol.licitar l'Autoritzacio dels establiments d'optica o de les seccions d'optica en oficines de farmacia.</w:t>
+      </w:r>
+    </w:p>
+    <w:p>
+      <w:pPr/>
+      <w:r>
+        <w:rPr>
+          <w:sz w:val="20"/>
+        </w:rPr>
+        <w:t>https://canalempresa.gencat.cat/ca/integraciodepartamentaltramit/tramit/PerTemes/Autoritzacio-dels-establiments-doptica-o-de-les-seccions-doptica-en-oficines-de-farmacia</w:t>
+      </w:r>
+    </w:p>
+    <w:p>
+      <w:pPr>
+        <w:pStyle w:val="Heading2"/>
+      </w:pPr>
+      <w:r>
+        <w:t>Ortopedia/audioprotesis - autoritzacio</w:t>
+      </w:r>
+    </w:p>
+    <w:p>
+      <w:pPr/>
+      <w:r>
+        <w:t>Optiques, ortopedies i audioprotesis. S'ha de sol.licitar l'Autoritzacio dels establiments d'ortopedia i d'audioprotesis.</w:t>
+      </w:r>
+    </w:p>
+    <w:p>
+      <w:pPr/>
+      <w:r>
+        <w:rPr>
+          <w:sz w:val="20"/>
+        </w:rPr>
+        <w:t>https://canalempresa.gencat.cat/ca/integraciodepartamentaltramit/tramit/PerTemes/Autoritzacio-dels-establiments-dortopedia-i-daudioprotesis</w:t>
+      </w:r>
+    </w:p>
+    <w:p>
+      <w:pPr>
+        <w:pStyle w:val="Heading2"/>
+      </w:pPr>
+      <w:r>
+        <w:t>Ortoprotetics a mida - autoritzacio sanitaria</w:t>
+      </w:r>
+    </w:p>
+    <w:p>
+      <w:pPr/>
+      <w:r>
+        <w:t>Optiques, ortopedies i audioprotesis. S'ha de sol.licitar l'Autoritzacio sanitaria d'empreses fabricants de productes sanitaris ortoprotetics a mida.</w:t>
+      </w:r>
+    </w:p>
+    <w:p>
+      <w:pPr/>
+      <w:r>
+        <w:rPr>
+          <w:sz w:val="20"/>
+        </w:rPr>
+        <w:t>https://canalempresa.gencat.cat/ca/integraciodepartamentaltramit/tramit/PerTemes/Autoritzacio-sanitaria-dempreses-fabricants-de-productes-sanitaris-ortoprotetics-a-mida</w:t>
+      </w:r>
+    </w:p>
+    <w:p>
+      <w:pPr>
+        <w:pStyle w:val="Heading2"/>
+      </w:pPr>
+      <w:r>
+        <w:t>Farmacies</w:t>
+      </w:r>
+    </w:p>
+    <w:p>
+      <w:pPr/>
+      <w:r>
+        <w:t>Farmacies i industria farmaceutica. S'ha de presentar la sol.licitud d'obertura concedida pel Col.legi Oficial de Farmaceutics de Barcelona.</w:t>
+      </w:r>
+    </w:p>
+    <w:p>
+      <w:pPr>
+        <w:pStyle w:val="Heading2"/>
+      </w:pPr>
+      <w:r>
+        <w:t>Estetica - bancs solars</w:t>
+      </w:r>
+    </w:p>
+    <w:p>
+      <w:pPr/>
+      <w:r>
+        <w:t>Centres d'estetica corporal: depilacio, tatuatges, pircing, bronzejat artificial. S'ha de sol.licitar la Presentacio de la declaracio responsable per a instal.lacions de bancs solars (posada en servei, modificacions i baixa).</w:t>
+      </w:r>
+    </w:p>
+    <w:p>
+      <w:pPr/>
+      <w:r>
+        <w:rPr>
+          <w:sz w:val="20"/>
+        </w:rPr>
+        <w:t>https://canalempresa.gencat.cat/ca/integraciodepartamentaltramit/tramit/PerTemes/Presentacio-de-la-declaracio-responsable-per-a-installacions-de-bancs-solars-posada-en-servei-modificacions-i-baixa</w:t>
+      </w:r>
+    </w:p>
+    <w:p>
+      <w:pPr>
+        <w:pStyle w:val="Heading2"/>
+      </w:pPr>
+      <w:r>
+        <w:t>Estetica - aplicador tatuatges/pircings</w:t>
+      </w:r>
+    </w:p>
+    <w:p>
+      <w:pPr/>
+      <w:r>
+        <w:t>Centres d'estetica corporal. S'ha de sol.licitar la Convalidacio o renovacio de la convalidacio de la formacio del personal aplicador de tatuatges, micropigmentacions i pircings.</w:t>
+      </w:r>
+    </w:p>
+    <w:p>
+      <w:pPr/>
+      <w:r>
+        <w:rPr>
+          <w:sz w:val="20"/>
+        </w:rPr>
+        <w:t>https://canalempresa.gencat.cat/ca/integraciodepartamentaltramit/tramit/PerTemes/Convalidacio-o-renovacio-de-la-convalidacio-de-la-formacio-del-personal-aplicador-de-tatuatges-micropigmentacions-i-pircings</w:t>
+      </w:r>
+    </w:p>
+    <w:p>
+      <w:pPr>
+        <w:pStyle w:val="Heading2"/>
+      </w:pPr>
+      <w:r>
+        <w:t>Estetica - homologacio cursos</w:t>
+      </w:r>
+    </w:p>
+    <w:p>
+      <w:pPr/>
+      <w:r>
+        <w:t>Centres d'estetica corporal. S'ha de sol.licitar l'Homologacio de cursos de formacio per a personal aplicador de tatuatges, micropigmentacions i pircings.</w:t>
+      </w:r>
+    </w:p>
+    <w:p>
+      <w:pPr/>
+      <w:r>
+        <w:rPr>
+          <w:sz w:val="20"/>
+        </w:rPr>
+        <w:t>https://canalempresa.gencat.cat/ca/integraciodepartamentaltramit/tramit/PerTemes/Sollicitud-dhomologacio-de-cursos-de-formacio-per-a-personal-aplicador-de-tatuatges-micropigmentacions-i-pircings</w:t>
+      </w:r>
+    </w:p>
+    <w:p>
+      <w:pPr>
+        <w:pStyle w:val="Heading2"/>
+      </w:pPr>
+      <w:r>
+        <w:t>DEA - inscripcio</w:t>
+      </w:r>
+    </w:p>
+    <w:p>
+      <w:pPr/>
+      <w:r>
+        <w:t>Desfibril.ladors. S'ha de notificar la instal.lacio inscrivint-la en el Registre de desfibril.ladors fora de l'ambit sanitari (DEA).</w:t>
+      </w:r>
+    </w:p>
+    <w:p>
+      <w:pPr/>
+      <w:r>
+        <w:rPr>
+          <w:sz w:val="20"/>
+        </w:rPr>
+        <w:t>https://canalempresa.gencat.cat/ca/integraciodepartamentaltramit/tramit/PerTemes/Inscripcio-modificacio-i-cancellacio-de-les-dades-dels-desfibrilladors-externs-automatics-de-centres-no-sanitaris</w:t>
+      </w:r>
+    </w:p>
+    <w:p>
+      <w:pPr>
+        <w:pStyle w:val="Heading2"/>
+      </w:pPr>
+      <w:r>
+        <w:t>DEA - entitat formadora</w:t>
+      </w:r>
+    </w:p>
+    <w:p>
+      <w:pPr/>
+      <w:r>
+        <w:t>Desfibril.ladors. S'ha de sol.licitar l'Autoritzacio per operar com a entitat formadora per a l'us de desfibril.ladors (DEA) i inscripcio en el Registre de formacio.</w:t>
+      </w:r>
+    </w:p>
+    <w:p>
+      <w:pPr/>
+      <w:r>
+        <w:rPr>
+          <w:sz w:val="20"/>
+        </w:rPr>
+        <w:t>https://canalempresa.gencat.cat/ca/integraciodepartamentaltramit/tramit/PerTemes/Autoritzacio-per-operar-com-a-entitat-formadora-per-a-lus-de-desfibrilladors-DEA</w:t>
+      </w:r>
+    </w:p>
+    <w:p>
+      <w:pPr>
+        <w:pStyle w:val="Heading2"/>
+      </w:pPr>
+      <w:r>
+        <w:t>Registres sanitaris - RSIPAC</w:t>
+      </w:r>
+    </w:p>
+    <w:p>
+      <w:pPr/>
+      <w:r>
+        <w:t>S'ha de justificar si l'activitat s'ha de registrar a nivell municipal o autonomic segons el quadre de Salut Alimentaria (https://canalempresa.gencat.cat/web/.content/oge/doc/QUADRE_Salut_Alimentaria.pdf). L'activitat s'ha d'inscriure en el Registre sanitari d'industries i productes alimentaris de Catalunya (RSIPAC).</w:t>
+      </w:r>
+    </w:p>
+    <w:p>
+      <w:pPr/>
+      <w:r>
+        <w:rPr>
+          <w:sz w:val="20"/>
+        </w:rPr>
+        <w:t>https://web.gencat.cat/ca/tramits/tramits-temes/Registre-sanitari-dindustries-i-productes-alimentaris-de-Cataluya-RSIPAC</w:t>
+      </w:r>
+    </w:p>
+    <w:p>
+      <w:pPr>
+        <w:pStyle w:val="Heading2"/>
+      </w:pPr>
+      <w:r>
+        <w:t>Registres sanitaris - DR salut alimentaria</w:t>
+      </w:r>
+    </w:p>
+    <w:p>
+      <w:pPr/>
+      <w:r>
+        <w:t>S'ha de justificar si l'activitat s'ha de registrar a nivell municipal o autonomic segons el quadre de Salut Alimentaria. L'activitat ha de presentar la Declaracio responsable en materia de salut alimentaria.</w:t>
+      </w:r>
+    </w:p>
+    <w:p>
+      <w:pPr/>
+      <w:r>
+        <w:rPr>
+          <w:sz w:val="20"/>
+        </w:rPr>
+        <w:t>https://www.seu-e.cat/ca/web/cornella/tramits-i-gestions/-/tramits/tramit/14387441?p_auth=xcFulVcY</w:t>
+      </w:r>
+    </w:p>
+    <w:p>
+      <w:pPr>
+        <w:pStyle w:val="Heading2"/>
+      </w:pPr>
+      <w:r>
+        <w:t>Comerc - mesures de seguretat</w:t>
+      </w:r>
+    </w:p>
+    <w:p>
+      <w:pPr/>
+      <w:r>
+        <w:t>Autoritzacio d'obertura, trasllat i comunicacio de reformes d'establiments obligats a disposar de mesures de seguretat i/o de dispensa d'alguna de les mesures. S'ha de sol.licitar l'obertura o el trasllat d'un establiment obligat a disposar de mesures de seguretat i/o de dispensa d'alguna de les mesures.</w:t>
+      </w:r>
+    </w:p>
+    <w:p>
+      <w:pPr/>
+      <w:r>
+        <w:rPr>
+          <w:sz w:val="20"/>
+        </w:rPr>
+        <w:t>https://interior.gencat.cat/ca/tramits/tramits-temes/21558_-_Autoritzacio-dobertura-trasllat-i-comunicacio-de-reformes-destabliments-obligats-a-disposar-de-mesures-de-seguretat-i-o-de-dispensa-dalguna-de-les-mesures</w:t>
+      </w:r>
+    </w:p>
+    <w:p>
+      <w:pPr>
+        <w:pStyle w:val="Heading2"/>
+      </w:pPr>
+      <w:r>
+        <w:t>API - Registre agents immobiliaris</w:t>
+      </w:r>
+    </w:p>
+    <w:p>
+      <w:pPr/>
+      <w:r>
+        <w:t>Agents de la propietat immobiliaria. El titular de l'activitat s'ha d'enregistrar en el Registre d'agents immobiliaris de Catalunya.</w:t>
+      </w:r>
+    </w:p>
+    <w:p>
+      <w:pPr/>
+      <w:r>
+        <w:rPr>
+          <w:sz w:val="20"/>
+        </w:rPr>
+        <w:t>https://canalempresa.gencat.cat/ca/integraciodepartamentaltramit/tramit/PerTemes/Registre_Agents_Immobiliaris_Catalunya</w:t>
+      </w:r>
+    </w:p>
+    <w:p>
+      <w:pPr>
+        <w:pStyle w:val="Heading1"/>
+      </w:pPr>
+      <w:r>
+        <w:t>Incendis - Evacuacio</w:t>
+      </w:r>
+    </w:p>
+    <w:p>
+      <w:pPr>
+        <w:pStyle w:val="Heading2"/>
+      </w:pPr>
+      <w:r>
+        <w:t>Evacuacio - portes practicables</w:t>
+      </w:r>
+    </w:p>
+    <w:p>
+      <w:pPr/>
+      <w:r>
+        <w:t>Evacuacio. Les portes d'emergencia han de ser practicables mentre l'activitat romangui oberta. S'ha d'entregar un certificat signat pel titular indicant que la porta que evacua a [CAMP: Adreca evacuacio porta emergencia] estara practicable mentre l'activitat estigui oberta.</w:t>
+      </w:r>
+    </w:p>
+    <w:p>
+      <w:pPr>
+        <w:pStyle w:val="Heading1"/>
+      </w:pPr>
+      <w:r>
+        <w:t>Incendis - Documentacio (ITC SP)</w:t>
+      </w:r>
+    </w:p>
+    <w:p>
+      <w:pPr>
+        <w:pStyle w:val="Heading2"/>
+      </w:pPr>
+      <w:r>
+        <w:t>ITC SP 136 - certificacio passiva</w:t>
+      </w:r>
+    </w:p>
+    <w:p>
+      <w:pPr/>
+      <w:r>
+        <w:t>ITC SP 136. Segons l'article 3.1 de l'Ordenanca relativa a la intervencio administrativa municipal en les activitats de Cornella de Llobregat s'ha d'entregar la Certificacio d'instal.lacio o aplicacio de productes de proteccio passiva contra incendis adjuntant la corresponent documentacio complementaria.</w:t>
+      </w:r>
+    </w:p>
+    <w:p>
+      <w:pPr/>
+      <w:r>
+        <w:rPr>
+          <w:sz w:val="20"/>
+        </w:rPr>
+        <w:t>https://interior.gencat.cat/web/.content/home/030_arees_dactuacio/bombers/prevencio_d_incendis/instruccions_guies_i_recomanacions/instruccions_tecniques_complementaries/documents/SP-136-Documentacio-passiva_web-Annexos-2.pdf</w:t>
+      </w:r>
+    </w:p>
+    <w:p>
+      <w:pPr>
+        <w:pStyle w:val="Heading2"/>
+      </w:pPr>
+      <w:r>
+        <w:t>SP 136 Model A - limitacio propagacio</w:t>
+      </w:r>
+    </w:p>
+    <w:p>
+      <w:pPr/>
+      <w:r>
+        <w:t>SP 136 Model A. Certificat d'instal.lacio de productes de limitacio de la propagacio d'incendis, adjuntant com a minim:</w:t>
+      </w:r>
+    </w:p>
+    <w:p>
+      <w:pPr/>
+      <w:r>
+        <w:rPr>
+          <w:sz w:val="20"/>
+        </w:rPr>
+        <w:t>https://interior.gencat.cat/web/.content/home/030_arees_dactuacio/bombers/prevencio_d_incendis/instruccions_guies_i_recomanacions/instruccions_tecniques_complementaries/documents/SP-136_A-Model-certificat-limitacio-propagacio.doc</w:t>
+      </w:r>
+    </w:p>
+    <w:p>
+      <w:pPr>
+        <w:pStyle w:val="Heading2"/>
+      </w:pPr>
+      <w:r>
+        <w:t>::CHILD:: SP 136 A - subministrament</w:t>
+      </w:r>
+    </w:p>
+    <w:p>
+      <w:pPr/>
+      <w:r>
+        <w:t>Documents de subministrament del producte.</w:t>
+      </w:r>
+    </w:p>
+    <w:p>
+      <w:pPr>
+        <w:pStyle w:val="Heading2"/>
+      </w:pPr>
+      <w:r>
+        <w:t>::CHILD:: SP 136 A - prestacions</w:t>
+      </w:r>
+    </w:p>
+    <w:p>
+      <w:pPr/>
+      <w:r>
+        <w:t>Documents acreditatius de les prestacions del producte.</w:t>
+      </w:r>
+    </w:p>
+    <w:p>
+      <w:pPr>
+        <w:pStyle w:val="Heading2"/>
+      </w:pPr>
+      <w:r>
+        <w:t>SP 136 Model B - reaccio al foc</w:t>
+      </w:r>
+    </w:p>
+    <w:p>
+      <w:pPr/>
+      <w:r>
+        <w:t>SP 136 Model B. Certificat d'aplicacio de productes de millora de la reaccio al foc, adjuntant com a minim:</w:t>
+      </w:r>
+    </w:p>
+    <w:p>
+      <w:pPr/>
+      <w:r>
+        <w:rPr>
+          <w:sz w:val="20"/>
+        </w:rPr>
+        <w:t>https://interior.gencat.cat/web/.content/home/030_arees_dactuacio/bombers/prevencio_d_incendis/instruccions_guies_i_recomanacions/instruccions_tecniques_complementaries/documents/SP-136_B-Model-certificat-millora-reaccio-al-foc.doc</w:t>
+      </w:r>
+    </w:p>
+    <w:p>
+      <w:pPr>
+        <w:pStyle w:val="Heading2"/>
+      </w:pPr>
+      <w:r>
+        <w:t>::CHILD:: SP 136 B - subministrament</w:t>
+      </w:r>
+    </w:p>
+    <w:p>
+      <w:pPr/>
+      <w:r>
+        <w:t>Documents de subministrament del producte.</w:t>
+      </w:r>
+    </w:p>
+    <w:p>
+      <w:pPr>
+        <w:pStyle w:val="Heading2"/>
+      </w:pPr>
+      <w:r>
+        <w:t>::CHILD:: SP 136 B - prestacions</w:t>
+      </w:r>
+    </w:p>
+    <w:p>
+      <w:pPr/>
+      <w:r>
+        <w:t>Documents acreditatius de les prestacions del producte.</w:t>
+      </w:r>
+    </w:p>
+    <w:p>
+      <w:pPr>
+        <w:pStyle w:val="Heading2"/>
+      </w:pPr>
+      <w:r>
+        <w:t>SP 136 Model C - proteccio estructures</w:t>
+      </w:r>
+    </w:p>
+    <w:p>
+      <w:pPr/>
+      <w:r>
+        <w:t>SP 136 Model C. Certificat d'instal.lacio o aplicacio de productes de proteccio d'estructures, adjuntant com a minim:</w:t>
+      </w:r>
+    </w:p>
+    <w:p>
+      <w:pPr/>
+      <w:r>
+        <w:rPr>
+          <w:sz w:val="20"/>
+        </w:rPr>
+        <w:t>https://interior.gencat.cat/web/.content/home/030_arees_dactuacio/bombers/prevencio_d_incendis/instruccions_guies_i_recomanacions/instruccions_tecniques_complementaries/documents/SP-136_C-Model-certificat-proteccio-estructures.doc</w:t>
+      </w:r>
+    </w:p>
+    <w:p>
+      <w:pPr>
+        <w:pStyle w:val="Heading2"/>
+      </w:pPr>
+      <w:r>
+        <w:t>::CHILD:: SP 136 C - subministrament</w:t>
+      </w:r>
+    </w:p>
+    <w:p>
+      <w:pPr/>
+      <w:r>
+        <w:t>Documents de subministrament del producte.</w:t>
+      </w:r>
+    </w:p>
+    <w:p>
+      <w:pPr>
+        <w:pStyle w:val="Heading2"/>
+      </w:pPr>
+      <w:r>
+        <w:t>::CHILD:: SP 136 C - prestacions</w:t>
+      </w:r>
+    </w:p>
+    <w:p>
+      <w:pPr/>
+      <w:r>
+        <w:t>Documents acreditatius de les prestacions del producte.</w:t>
+      </w:r>
+    </w:p>
+    <w:p>
+      <w:pPr>
+        <w:pStyle w:val="Heading2"/>
+      </w:pPr>
+      <w:r>
+        <w:t>ITC SP 108 - lluernes en coberta</w:t>
+      </w:r>
+    </w:p>
+    <w:p>
+      <w:pPr/>
+      <w:r>
+        <w:t>ITC SP 108. Segons l'article 3.2 de l'Ordenanca relativa a la intervencio administrativa municipal en les activitats de Cornella de Llobregat s'ha de justificar el compliment de la SP 108 «Lluernes en coberta en establiments industrials», adjuntant com a minim:</w:t>
+      </w:r>
+    </w:p>
+    <w:p>
+      <w:pPr/>
+      <w:r>
+        <w:rPr>
+          <w:sz w:val="20"/>
+        </w:rPr>
+        <w:t>https://interior.gencat.cat/web/.content/home/030_arees_dactuacio/bombers/prevencio_d_incendis/instruccions_guies_i_recomanacions/instruccions_tecniques_complementaries/documents/sp108.pdf</w:t>
+      </w:r>
+    </w:p>
+    <w:p>
+      <w:pPr>
+        <w:pStyle w:val="Heading2"/>
+      </w:pPr>
+      <w:r>
+        <w:t>::CHILD:: SP 108 - subministrament</w:t>
+      </w:r>
+    </w:p>
+    <w:p>
+      <w:pPr/>
+      <w:r>
+        <w:t>Documents de subministrament del producte.</w:t>
+      </w:r>
+    </w:p>
+    <w:p>
+      <w:pPr>
+        <w:pStyle w:val="Heading2"/>
+      </w:pPr>
+      <w:r>
+        <w:t>::CHILD:: SP 108 - prestacions</w:t>
+      </w:r>
+    </w:p>
+    <w:p>
+      <w:pPr/>
+      <w:r>
+        <w:t>Documents acreditatius de les prestacions del producte.</w:t>
+      </w:r>
+    </w:p>
+    <w:p>
+      <w:pPr>
+        <w:pStyle w:val="Heading1"/>
+      </w:pPr>
+      <w:r>
+        <w:t>Incendis - RIPCI</w:t>
+      </w:r>
+    </w:p>
+    <w:p>
+      <w:pPr>
+        <w:pStyle w:val="Heading2"/>
+      </w:pPr>
+      <w:r>
+        <w:t>RIPCI - posada en servei</w:t>
+      </w:r>
+    </w:p>
+    <w:p>
+      <w:pPr/>
+      <w:r>
+        <w:t>Posada en servei. Es requereix tenir subscrit un contracte de manteniment amb una empresa mantenidora degudament habilitada, que cobreixi, almenys, els manteniments dels equips i sistemes subjectes al RIPCI (Real Decreto 513/2017, de 22 de mayo, por el que se aprueba el Reglamento de instalaciones de proteccion contra incendios), segons correspongui.</w:t>
+      </w:r>
+    </w:p>
+    <w:p>
+      <w:pPr>
+        <w:pStyle w:val="Heading2"/>
+      </w:pPr>
+      <w:r>
+        <w:t>RIPCI - manteniment extintors</w:t>
+      </w:r>
+    </w:p>
+    <w:p>
+      <w:pPr/>
+      <w:r>
+        <w:t>Manteniment. Els extintors han d'estar correctament revisats.</w:t>
+      </w:r>
+    </w:p>
+    <w:p>
+      <w:pPr>
+        <w:pStyle w:val="Heading2"/>
+      </w:pPr>
+      <w:r>
+        <w:t>Extintors - emplacament</w:t>
+      </w:r>
+    </w:p>
+    <w:p>
+      <w:pPr/>
+      <w:r>
+        <w:t>Extintors. L'emplacament dels extintors permetra que siguin facilment visibles i accessibles, estaran situats proxims als punts on s'estimi major probabilitat d'iniciar-se l'incendi i, si pot ser, proxims a les sortides d'evacuacio.</w:t>
+      </w:r>
+    </w:p>
+    <w:p>
+      <w:pPr>
+        <w:pStyle w:val="Heading2"/>
+      </w:pPr>
+      <w:r>
+        <w:t>Extintors - alcada</w:t>
+      </w:r>
+    </w:p>
+    <w:p>
+      <w:pPr/>
+      <w:r>
+        <w:t>Extintors. La part superior dels extintors ha de quedar situada entre 80 cm i 120 cm sobre el terra.</w:t>
+      </w:r>
+    </w:p>
+    <w:p>
+      <w:pPr>
+        <w:pStyle w:val="Heading2"/>
+      </w:pPr>
+      <w:r>
+        <w:t>Extintors - recorregut maxim</w:t>
+      </w:r>
+    </w:p>
+    <w:p>
+      <w:pPr/>
+      <w:r>
+        <w:t>Extintors. El recorregut maxim horitzontal des de qualsevol punt del sector d'incendi fins a l'extintor no pot superar els 15 m.</w:t>
+      </w:r>
+    </w:p>
+    <w:p>
+      <w:pPr>
+        <w:pStyle w:val="Heading2"/>
+      </w:pPr>
+      <w:r>
+        <w:t>Extintors - manteniment UNE 23120</w:t>
+      </w:r>
+    </w:p>
+    <w:p>
+      <w:pPr/>
+      <w:r>
+        <w:t>Extintors. S'han de realitzar les operacions de manteniment segons el que s'estableix en el «Programa de Manteniment Anual» de la norma UNE 23120.</w:t>
+      </w:r>
+    </w:p>
+    <w:p>
+      <w:pPr>
+        <w:pStyle w:val="Heading2"/>
+      </w:pPr>
+      <w:r>
+        <w:t>BIEs - alcada valvula</w:t>
+      </w:r>
+    </w:p>
+    <w:p>
+      <w:pPr/>
+      <w:r>
+        <w:t>BIEs. La valvula d'obertura manual i el sistema d'obertura de l'armari de la BIE, si n'hi ha, han d'estar situats com a maxim a 1,50 m sobre el nivell del terra.</w:t>
+      </w:r>
+    </w:p>
+    <w:p>
+      <w:pPr>
+        <w:pStyle w:val="Heading2"/>
+      </w:pPr>
+      <w:r>
+        <w:t>BIEs - distancia sortides</w:t>
+      </w:r>
+    </w:p>
+    <w:p>
+      <w:pPr/>
+      <w:r>
+        <w:t>BIEs. Les BIE se situaran sempre a una distancia maxima de 5 m de les sortides del sector d'incendi, mesurada sobre un recorregut d'evacuacio, sense que constitueixin obstacle per a la seva utilitzacio.</w:t>
+      </w:r>
+    </w:p>
+    <w:p>
+      <w:pPr>
+        <w:pStyle w:val="Heading2"/>
+      </w:pPr>
+      <w:r>
+        <w:t>BIEs - separacio entre BIE</w:t>
+      </w:r>
+    </w:p>
+    <w:p>
+      <w:pPr/>
+      <w:r>
+        <w:t>BIEs. Per a les BIE amb manega semirigida o manega plana, la separacio maxima entre cada BIE i la seva mes proxima sera de 50 m. La distancia des de qualsevol punt de l'area protegida fins a la BIE mes proxima no haura d'excedir del radi d'accio d'aquesta. Tant la separacio, com la distancia maxima i el radi d'accio es mesuraran seguint recorreguts d'evacuacio.</w:t>
+      </w:r>
+    </w:p>
+    <w:p>
+      <w:pPr>
+        <w:pStyle w:val="Heading2"/>
+      </w:pPr>
+      <w:r>
+        <w:t>BIEs - zona lliure</w:t>
+      </w:r>
+    </w:p>
+    <w:p>
+      <w:pPr/>
+      <w:r>
+        <w:t>BIEs. S'haura de mantenir al voltant de cada BIE una zona lliure d'obstacles, que permeti l'acces a ella i la seva maniobra sense dificultat.</w:t>
+      </w:r>
+    </w:p>
+    <w:p>
+      <w:pPr>
+        <w:pStyle w:val="Heading2"/>
+      </w:pPr>
+      <w:r>
+        <w:t>BIEs - pressio</w:t>
+      </w:r>
+    </w:p>
+    <w:p>
+      <w:pPr/>
+      <w:r>
+        <w:t>BIEs. Les BIEs de 45 mm han d'obtenir una pressio manometrica entre 5,4 i 8,4 bar. Les BIEs de 25 mm han d'obtenir una pressio manometrica entre 3,5 i 6,5 bar.</w:t>
+      </w:r>
+    </w:p>
+    <w:p>
+      <w:pPr>
+        <w:pStyle w:val="Heading2"/>
+      </w:pPr>
+      <w:r>
+        <w:t>BIEs - manteniment UNE-EN 671-3</w:t>
+      </w:r>
+    </w:p>
+    <w:p>
+      <w:pPr/>
+      <w:r>
+        <w:t>BIEs. S'han de realitzar les operacions d'inspeccio i manteniment anuals segons el que s'estableix la UNE-EN 671-3.</w:t>
+      </w:r>
+    </w:p>
+    <w:p>
+      <w:pPr>
+        <w:pStyle w:val="Heading2"/>
+      </w:pPr>
+      <w:r>
+        <w:t>Senyalitzacio PCI</w:t>
+      </w:r>
+    </w:p>
+    <w:p>
+      <w:pPr/>
+      <w:r>
+        <w:t>Senyalitzacio. La senyalitzacio dels mitjans de proteccio contra incendis d'utilitzacio manual i dels sistemes d'alerta i alarma, hauran de complir la norma UNE 23033-1. Els senyals no definits en aquesta norma es podran dissenyar amb els mateixos criteris establerts en la norma UNE 23033-1, en la UNE 23032 i a la UNE-EN ISO 7010.</w:t>
+      </w:r>
+    </w:p>
+    <w:p>
+      <w:pPr>
+        <w:pStyle w:val="Heading2"/>
+      </w:pPr>
+      <w:r>
+        <w:t>Enllumenat emergencia</w:t>
+      </w:r>
+    </w:p>
+    <w:p>
+      <w:pPr/>
+      <w:r>
+        <w:t>Enllumenat emergencia. Les instal.lacions d'enllumenat d'emergencia seran conformes a les especificacions establertes en el Reglament Electrotecnic de Baixa Tensio, aprovat per Real Decreto 842/2002, de 2 d'agost, i en la Instruccio Tecnica Complementaria ITC-BT-28.</w:t>
+      </w:r>
+    </w:p>
+    <w:p>
+      <w:pPr>
+        <w:pStyle w:val="Heading1"/>
+      </w:pPr>
+      <w:r>
+        <w:t>Incendis - CTE DB SI</w:t>
+      </w:r>
+    </w:p>
+    <w:p>
+      <w:pPr>
+        <w:pStyle w:val="Heading2"/>
+      </w:pPr>
+      <w:r>
+        <w:t>CTE DB SI 1 - Propagacio interior</w:t>
+      </w:r>
+    </w:p>
+    <w:p>
+      <w:pPr/>
+      <w:r>
+        <w:t>S'ha de justificar el CTE DB SI 1 Propagacio interior, mes especificament:</w:t>
+      </w:r>
+    </w:p>
+    <w:p>
+      <w:pPr>
+        <w:pStyle w:val="Heading2"/>
+      </w:pPr>
+      <w:r>
+        <w:t>::CHILD:: SI 1.1 - Compartimentacion sectores</w:t>
+      </w:r>
+    </w:p>
+    <w:p>
+      <w:pPr/>
+      <w:r>
+        <w:t>1 Compartimentacion en sectores de incendio.</w:t>
+      </w:r>
+    </w:p>
+    <w:p>
+      <w:pPr>
+        <w:pStyle w:val="Heading2"/>
+      </w:pPr>
+      <w:r>
+        <w:t>::CHILD:: SI 1.2 - Locales y zonas de riesgo especial</w:t>
+      </w:r>
+    </w:p>
+    <w:p>
+      <w:pPr/>
+      <w:r>
+        <w:t>2 Locales y zonas de riesgo especial.</w:t>
+      </w:r>
+    </w:p>
+    <w:p>
+      <w:pPr>
+        <w:pStyle w:val="Heading2"/>
+      </w:pPr>
+      <w:r>
+        <w:t>::CHILD:: SI 1.3 - Espacios ocultos</w:t>
+      </w:r>
+    </w:p>
+    <w:p>
+      <w:pPr/>
+      <w:r>
+        <w:t>3 Espacios ocultos. Paso de instalaciones a traves de elementos de compartimentacion de incendios.</w:t>
+      </w:r>
+    </w:p>
+    <w:p>
+      <w:pPr>
+        <w:pStyle w:val="Heading2"/>
+      </w:pPr>
+      <w:r>
+        <w:t>::CHILD:: SI 1.4 - Reaccion al fuego</w:t>
+      </w:r>
+    </w:p>
+    <w:p>
+      <w:pPr/>
+      <w:r>
+        <w:t>4 Reaccion al fuego de los elementos constructivos, decorativos y de mobiliario.</w:t>
+      </w:r>
+    </w:p>
+    <w:p>
+      <w:pPr>
+        <w:pStyle w:val="Heading2"/>
+      </w:pPr>
+      <w:r>
+        <w:t>CTE DB SI 2 - Propagacio exterior</w:t>
+      </w:r>
+    </w:p>
+    <w:p>
+      <w:pPr/>
+      <w:r>
+        <w:t>S'ha de justificar el CTE DB SI 2 Propagacio exterior, mes especificament:</w:t>
+      </w:r>
+    </w:p>
+    <w:p>
+      <w:pPr>
+        <w:pStyle w:val="Heading2"/>
+      </w:pPr>
+      <w:r>
+        <w:t>::CHILD:: SI 2.1 - Medianerias y fachadas</w:t>
+      </w:r>
+    </w:p>
+    <w:p>
+      <w:pPr/>
+      <w:r>
+        <w:t>1 Medianerias y fachadas.</w:t>
+      </w:r>
+    </w:p>
+    <w:p>
+      <w:pPr>
+        <w:pStyle w:val="Heading2"/>
+      </w:pPr>
+      <w:r>
+        <w:t>::CHILD:: SI 2.2 - Cubiertas</w:t>
+      </w:r>
+    </w:p>
+    <w:p>
+      <w:pPr/>
+      <w:r>
+        <w:t>2 Cubiertas.</w:t>
+      </w:r>
+    </w:p>
+    <w:p>
+      <w:pPr>
+        <w:pStyle w:val="Heading2"/>
+      </w:pPr>
+      <w:r>
+        <w:t>CTE DB SI 3 - Evacuacio d'ocupants</w:t>
+      </w:r>
+    </w:p>
+    <w:p>
+      <w:pPr/>
+      <w:r>
+        <w:t>S'ha de justificar el CTE DB SI 3 Evacuacio d'ocupants, mes especificament:</w:t>
+      </w:r>
+    </w:p>
+    <w:p>
+      <w:pPr>
+        <w:pStyle w:val="Heading2"/>
+      </w:pPr>
+      <w:r>
+        <w:t>::CHILD:: SI 3.1 - Compatibilidad elementos</w:t>
+      </w:r>
+    </w:p>
+    <w:p>
+      <w:pPr/>
+      <w:r>
+        <w:t>1 Compatibilidad de los elementos de evacuacion.</w:t>
+      </w:r>
+    </w:p>
+    <w:p>
+      <w:pPr>
+        <w:pStyle w:val="Heading2"/>
+      </w:pPr>
+      <w:r>
+        <w:t>::CHILD:: SI 3.2 - Calculo ocupacion</w:t>
+      </w:r>
+    </w:p>
+    <w:p>
+      <w:pPr/>
+      <w:r>
+        <w:t>2 Calculo de la ocupacion.</w:t>
+      </w:r>
+    </w:p>
+    <w:p>
+      <w:pPr>
+        <w:pStyle w:val="Heading2"/>
+      </w:pPr>
+      <w:r>
+        <w:t>::CHILD:: SI 3.3 - Salidas y recorridos</w:t>
+      </w:r>
+    </w:p>
+    <w:p>
+      <w:pPr/>
+      <w:r>
+        <w:t>3 Numero de salidas y longitud de los recorridos de evacuacion.</w:t>
+      </w:r>
+    </w:p>
+    <w:p>
+      <w:pPr>
+        <w:pStyle w:val="Heading2"/>
+      </w:pPr>
+      <w:r>
+        <w:t>::CHILD:: SI 3.4 - Dimensionado medios</w:t>
+      </w:r>
+    </w:p>
+    <w:p>
+      <w:pPr/>
+      <w:r>
+        <w:t>4 Dimensionado de los medios de evacuacion.</w:t>
+      </w:r>
+    </w:p>
+    <w:p>
+      <w:pPr>
+        <w:pStyle w:val="Heading2"/>
+      </w:pPr>
+      <w:r>
+        <w:t>::CHILD:: SI 3.5 - Proteccion escaleras</w:t>
+      </w:r>
+    </w:p>
+    <w:p>
+      <w:pPr/>
+      <w:r>
+        <w:t>5 Proteccion de las escaleras.</w:t>
+      </w:r>
+    </w:p>
+    <w:p>
+      <w:pPr>
+        <w:pStyle w:val="Heading2"/>
+      </w:pPr>
+      <w:r>
+        <w:t>::CHILD:: SI 3.6 - Puertas en recorridos</w:t>
+      </w:r>
+    </w:p>
+    <w:p>
+      <w:pPr/>
+      <w:r>
+        <w:t>6 Puertas situadas en recorridos de evacuacion. Inclou: Validez de las puertas para vehiculos para la evacuacion de personas - Ningun porton para vehiculos, ya sea manual o motorizado, es valido por si mismo como elemento para la evacuacion de personas. No obstante, dichos portones pueden contener una puerta peatonal valida para dicha evacuacion si, conforme a SUA 2-1.2.3, tienen marcado CE de conformidad con los correspondientes Reglamentos y Directivas Europeas. Condiciones aplicables a un hueco de salida - El compromiso personal del titular de un establecimiento de que las puertas vayan a permanecer abiertas no puede considerarse una solucion alternativa. Puertas peatonales automaticas (apartado 5) - Dispondran de un sistema que en caso de fallo en el suministro electrico o senal de emergencia, excepto en posicion de cerrado seguro: si es puerta corredera o plegable, abra y mantenga la puerta abierta o permita su apertura abatible en el sentido de la evacuacion mediante simple empuje con una fuerza total que no exceda de 220 N (la opcion de apertura abatible no se admite si esta en un itinerario accesible segun DB SUA); si es puerta abatible o giro-batiente, abra y mantenga la puerta abierta o permita su abatimiento en el sentido de la evacuacion mediante simple empuje con una fuerza total que no exceda de 150 N (en itinerario accesible: no exceder 25 N en general y 65 N si es resistente al fuego).</w:t>
+      </w:r>
+    </w:p>
+    <w:p>
+      <w:pPr>
+        <w:pStyle w:val="Heading2"/>
+      </w:pPr>
+      <w:r>
+        <w:t>::CHILD:: SI 3.7 - Senalizacion medios evacuacion</w:t>
+      </w:r>
+    </w:p>
+    <w:p>
+      <w:pPr/>
+      <w:r>
+        <w:t>7 Senalizacion de los medios de evacuacion.</w:t>
+      </w:r>
+    </w:p>
+    <w:p>
+      <w:pPr>
+        <w:pStyle w:val="Heading2"/>
+      </w:pPr>
+      <w:r>
+        <w:t>::CHILD:: SI 3.8 - Control humo</w:t>
+      </w:r>
+    </w:p>
+    <w:p>
+      <w:pPr/>
+      <w:r>
+        <w:t>8 Control del humo de incendio.</w:t>
+      </w:r>
+    </w:p>
+    <w:p>
+      <w:pPr>
+        <w:pStyle w:val="Heading2"/>
+      </w:pPr>
+      <w:r>
+        <w:t>::CHILD:: SI 3.9 - Evacuacion discapacitats</w:t>
+      </w:r>
+    </w:p>
+    <w:p>
+      <w:pPr/>
+      <w:r>
+        <w:t>9 Evacuacion de personas con discapacidad en caso de incendio.</w:t>
+      </w:r>
+    </w:p>
+    <w:p>
+      <w:pPr>
+        <w:pStyle w:val="Heading2"/>
+      </w:pPr>
+      <w:r>
+        <w:t>CTE DB SI 4 - Instal.lacions PCI</w:t>
+      </w:r>
+    </w:p>
+    <w:p>
+      <w:pPr/>
+      <w:r>
+        <w:t>S'ha de justificar el CTE DB SI 4 Instal.lacions de proteccio contra incendis, mes especificament:</w:t>
+      </w:r>
+    </w:p>
+    <w:p>
+      <w:pPr>
+        <w:pStyle w:val="Heading2"/>
+      </w:pPr>
+      <w:r>
+        <w:t>::CHILD:: SI 4.1 - Dotacion instalaciones PCI</w:t>
+      </w:r>
+    </w:p>
+    <w:p>
+      <w:pPr/>
+      <w:r>
+        <w:t>1 Dotacion de instalaciones de proteccion contra incendios.</w:t>
+      </w:r>
+    </w:p>
+    <w:p>
+      <w:pPr>
+        <w:pStyle w:val="Heading2"/>
+      </w:pPr>
+      <w:r>
+        <w:t>CTE DB SI 5 - Intervencio bombers</w:t>
+      </w:r>
+    </w:p>
+    <w:p>
+      <w:pPr/>
+      <w:r>
+        <w:t>S'ha de justificar el CTE DB SI 5 Intervencio de bombers, mes especificament:</w:t>
+      </w:r>
+    </w:p>
+    <w:p>
+      <w:pPr>
+        <w:pStyle w:val="Heading2"/>
+      </w:pPr>
+      <w:r>
+        <w:t>::CHILD:: SI 5.1 - Aproximacion y entorno</w:t>
+      </w:r>
+    </w:p>
+    <w:p>
+      <w:pPr/>
+      <w:r>
+        <w:t>1 Condiciones de aproximacion y entorno.</w:t>
+      </w:r>
+    </w:p>
+    <w:p>
+      <w:pPr>
+        <w:pStyle w:val="Heading2"/>
+      </w:pPr>
+      <w:r>
+        <w:t>::CHILD:: SI 5.2 - Accesibilidad fachada</w:t>
+      </w:r>
+    </w:p>
+    <w:p>
+      <w:pPr/>
+      <w:r>
+        <w:t>2 Accesibilidad por fachada.</w:t>
+      </w:r>
+    </w:p>
+    <w:p>
+      <w:pPr>
+        <w:pStyle w:val="Heading2"/>
+      </w:pPr>
+      <w:r>
+        <w:t>CTE DB SI 6 - Resistencia al foc</w:t>
+      </w:r>
+    </w:p>
+    <w:p>
+      <w:pPr/>
+      <w:r>
+        <w:t>S'ha de justificar el CTE DB SI 6 Resistencia al foc de l'estructura, mes especificament:</w:t>
+      </w:r>
+    </w:p>
+    <w:p>
+      <w:pPr>
+        <w:pStyle w:val="Heading2"/>
+      </w:pPr>
+      <w:r>
+        <w:t>::CHILD:: SI 6.3 - Elementos estructurales principales</w:t>
+      </w:r>
+    </w:p>
+    <w:p>
+      <w:pPr/>
+      <w:r>
+        <w:t>3 Elementos estructurales principales.</w:t>
+      </w:r>
+    </w:p>
+    <w:p>
+      <w:pPr>
+        <w:pStyle w:val="Heading2"/>
+      </w:pPr>
+      <w:r>
+        <w:t>::CHILD:: SI 6.4 - Elementos estructurales secundarios</w:t>
+      </w:r>
+    </w:p>
+    <w:p>
+      <w:pPr/>
+      <w:r>
+        <w:t>4 Elementos estructurales secundarios.</w:t>
+      </w:r>
+    </w:p>
+    <w:p>
+      <w:pPr>
+        <w:pStyle w:val="Heading2"/>
+      </w:pPr>
+      <w:r>
+        <w:t>::CHILD:: SI 6.6 - Determinacion resistencia</w:t>
+      </w:r>
+    </w:p>
+    <w:p>
+      <w:pPr/>
+      <w:r>
+        <w:t>6 Determinacion de la resistencia al fuego.</w:t>
+      </w:r>
+    </w:p>
+    <w:p>
+      <w:pPr>
+        <w:pStyle w:val="Heading1"/>
+      </w:pPr>
+      <w:r>
+        <w:t>Projecte</w:t>
+      </w:r>
+    </w:p>
+    <w:p>
+      <w:pPr>
+        <w:pStyle w:val="Heading2"/>
+      </w:pPr>
+      <w:r>
+        <w:t>Llum</w:t>
+      </w:r>
+    </w:p>
+    <w:p>
+      <w:pPr/>
+      <w:r>
+        <w:t>Llum. L'activitat esta inclosa dins l'Article 3 del DECRET 190/2015, de 25 d'agost, de desplegament de la Llei 6/2001, de 31 de maig, d'ordenacio ambiental de l'enllumenament per a la proteccio del medi nocturn. S'ha d'entregar documentacio que acrediti el compliment dels requisits tecnics segons l'Annex 1 de l'esmentat Decret.</w:t>
+      </w:r>
+    </w:p>
+    <w:p>
+      <w:pPr>
+        <w:pStyle w:val="Heading2"/>
+      </w:pPr>
+      <w:r>
+        <w:t>Modificacio activitat - Llei 18/2020</w:t>
+      </w:r>
+    </w:p>
+    <w:p>
+      <w:pPr/>
+      <w:r>
+        <w:t>Modificacio de l'activitat. L'activitat es regeix per la LLEI 18/2020, del 28 de desembre, de facilitacio de l'activitat economica. S'ha de justificar si la modificacio es substancial o no segons els criteris de l'Article 53 del Decret 131/2022, de 5 de juliol, del Reglament de la Llei de facilitacio de l'activitat economica.</w:t>
+      </w:r>
+    </w:p>
+    <w:p>
+      <w:pPr>
+        <w:pStyle w:val="Heading2"/>
+      </w:pPr>
+      <w:r>
+        <w:t>Modificacio activitat - Llei 20/2009</w:t>
+      </w:r>
+    </w:p>
+    <w:p>
+      <w:pPr/>
+      <w:r>
+        <w:t>Modificacio de l'activitat. L'activitat es regeix per la LLEI 20/2009, del 4 de desembre, de prevencio i control ambiental de les activitats. S'ha de justificar si la modificacio es substancial o no segons els criteris del document «ACTUALITZACIO DELS CRITERIS DE SUBSTANCIALITAT DE LES MODIFICACIONS DE LES ACTIVITATS DE LA LLEI 20/2009, DEL 4 DE DESEMBRE, DE PREVENCIO I CONTROL AMBIENTAL D'ACTIVITATS» de la Generalitat de Catalunya.</w:t>
+      </w:r>
+    </w:p>
+    <w:p>
+      <w:pPr/>
+      <w:r>
+        <w:rPr>
+          <w:sz w:val="20"/>
+        </w:rPr>
+        <w:t>https://mediambient.gencat.cat/ca/05_ambits_dactuacio/empresa_i_produccio_sostenible/prevencio_i_control_dactivitats/la_llei_de_prevencio_i_control_ambiental_dactivitats/llei_20_2009_pcaa/modificacions_de_les_activitats/</w:t>
+      </w:r>
+    </w:p>
+    <w:p>
+      <w:pPr>
+        <w:pStyle w:val="Heading1"/>
+      </w:pPr>
+      <w:r>
+        <w:t>Activitat</w:t>
+      </w:r>
+    </w:p>
+    <w:p>
+      <w:pPr>
+        <w:pStyle w:val="Heading2"/>
+      </w:pPr>
+      <w:r>
+        <w:t>Tapiar zones sense us</w:t>
+      </w:r>
+    </w:p>
+    <w:p>
+      <w:pPr/>
+      <w:r>
+        <w:t>S'han de tapiar aquelles zones sense us de l'activitat i demostrar-ho adjuntant material fotografic.</w:t>
+      </w:r>
+    </w:p>
+    <w:p>
+      <w:pPr>
+        <w:pStyle w:val="Heading2"/>
+      </w:pPr>
+      <w:r>
+        <w:t>Alcades minimes</w:t>
+      </w:r>
+    </w:p>
+    <w:p>
+      <w:pPr/>
+      <w:r>
+        <w:t>No es pot fer us d'aquelles zones que disposin d'una alcada inferior a 2,5 m (a excepcio dels magatzems i els lavabos que poden tenir 2,2 m d'alcada). [CAMP: Exemples zones sense us (opcional)].</w:t>
+      </w:r>
+    </w:p>
+    <w:p>
+      <w:pPr>
+        <w:pStyle w:val="Heading2"/>
+      </w:pPr>
+      <w:r>
+        <w:t>Amplada passadissos</w:t>
+      </w:r>
+    </w:p>
+    <w:p>
+      <w:pPr/>
+      <w:r>
+        <w:t>Per les caracteristiques del local i la normativa vigent, els passadissos han de ser [CAMP: Amplada minima passadissos (m)] d'ample minim. S'ha d'entregar una fotografia on es pugui observar que l'ample de tots els passadissos compleix.</w:t>
+      </w:r>
+    </w:p>
+    <w:p>
+      <w:pPr>
+        <w:pStyle w:val="Heading2"/>
+      </w:pPr>
+      <w:r>
+        <w:t>Modificacio activitat - tramitar</w:t>
+      </w:r>
+    </w:p>
+    <w:p>
+      <w:pPr/>
+      <w:r>
+        <w:t>Hi ha modificacions en l'activitat. S'ha de tramitar una modificacio de l'activitat.</w:t>
+      </w:r>
+    </w:p>
+    <w:p>
+      <w:pPr>
+        <w:pStyle w:val="Heading2"/>
+      </w:pPr>
+      <w:r>
+        <w:t>Retirar barra via publica</w:t>
+      </w:r>
+    </w:p>
+    <w:p>
+      <w:pPr/>
+      <w:r>
+        <w:t>D'acord amb el que disposa l'article 6.1 de l'Ordenanca General de Convivencia Ciutadana de Cornella de Llobregat: «L'Ajuntament de Cornella de Llobregat vetllara perque no es consumeixin begudes alcoholiques en els espais publics». Es requereix al titular de l'activitat que retiri immediatament la barra que dona a la via publica i procedeixi al tancament del forat de facana que ara mateix ocupa aquesta barra.</w:t>
+      </w:r>
+    </w:p>
+    <w:p>
+      <w:pPr>
+        <w:pStyle w:val="Heading2"/>
+      </w:pPr>
+      <w:r>
+        <w:t>Farmaciola</w:t>
+      </w:r>
+    </w:p>
+    <w:p>
+      <w:pPr/>
+      <w:r>
+        <w:t>No es disposa de farmaciola.</w:t>
+      </w:r>
+    </w:p>
+    <w:p>
+      <w:pPr>
+        <w:pStyle w:val="Heading2"/>
+      </w:pPr>
+      <w:r>
+        <w:t>Vestibul previ lavabo</w:t>
+      </w:r>
+    </w:p>
+    <w:p>
+      <w:pPr/>
+      <w:r>
+        <w:t>No disposa de vestibul previ entre el lavabo i la sala. En aquest s'ha de poder inscriure un cercle de [CAMP: Diametre cercle vestibul (m) (p. ex. 1,50 o 1,20)] de diametre lliure d'obstacles.</w:t>
+      </w:r>
+    </w:p>
+    <w:p>
+      <w:pPr>
+        <w:pStyle w:val="Heading2"/>
+      </w:pPr>
+      <w:r>
+        <w:t>Sabo i secamans lavabos</w:t>
+      </w:r>
+    </w:p>
+    <w:p>
+      <w:pPr/>
+      <w:r>
+        <w:t>Tots els lavabos han de disposar de sabo de mans i secamans.</w:t>
+      </w:r>
+    </w:p>
+    <w:p>
+      <w:pPr>
+        <w:pStyle w:val="Heading1"/>
+      </w:pPr>
+      <w:r>
+        <w:t>Restauracio - Cuina i extraccio de fums</w:t>
+      </w:r>
+    </w:p>
+    <w:p>
+      <w:pPr>
+        <w:pStyle w:val="Heading2"/>
+      </w:pPr>
+      <w:r>
+        <w:t>Elements coccio sense extraccio</w:t>
+      </w:r>
+    </w:p>
+    <w:p>
+      <w:pPr/>
+      <w:r>
+        <w:t>Elements de coccio. Segons l'article 11.1 de l'Ordenanca relativa a la intervencio administrativa municipal en les activitats de Cornella de Llobregat les activitats de restauracio que no tinguin extraccio de fums fins a coberta unicament podran disposar dels seguents elements de coccio: una planxa electrica de fins a 2.500 W de potencia i fins a 40x40 cm de mesura; forns electrics de fins a 7.500 W de potencia (suma de potencies de tots els forns) i amb recollida de vapor per condensacio. Si es disposen de mes elements de coccio que els esmentats i no es disposa d'extraccio de fums s'hauran de retirar immediatament. Si aquests elements de coccio creen molesties al veinat, s'hauran de prendre les mesures correctores que indiqui el tecnic municipal competent, podent comportar igualment la seva retirada.</w:t>
+      </w:r>
+    </w:p>
+    <w:p>
+      <w:pPr>
+        <w:pStyle w:val="Heading2"/>
+      </w:pPr>
+      <w:r>
+        <w:t>Sectoritzacio conductes</w:t>
+      </w:r>
+    </w:p>
+    <w:p>
+      <w:pPr/>
+      <w:r>
+        <w:t>Sectoritzacio. Segons l'article 11.3 de l'Ordenanca relativa a la intervencio administrativa municipal en les activitats de Cornella de Llobregat s'ha de justificar, i aportar la documentacio corresponent, el compliment del Document TINSCI DT 18 «Sectoritzacio de conductes d'extraccio de fums de les cuines».</w:t>
+      </w:r>
+    </w:p>
+    <w:p>
+      <w:pPr>
+        <w:pStyle w:val="Heading2"/>
+      </w:pPr>
+      <w:r>
+        <w:t>Xemeneia - alcada coberta</w:t>
+      </w:r>
+    </w:p>
+    <w:p>
+      <w:pPr/>
+      <w:r>
+        <w:t>Xemeneia. Segons l'article 11.4 de l'Ordenanca relativa a la intervencio administrativa municipal en les activitats de Cornella de Llobregat s'ha de justificar el compliment de l'apartat 6.2.1.3 de la norma UNE 123001 on s'especifica el seguent: «El remate debe elevarse mas de 1 m por encima de la parte mas alta de cualquier edificacion situada en un radio inferior a 10 m respecto a la salida de la chimenea». S'ha d'aportar un planol en planta de la coberta i un planol en seccio de l'edifici on es justifiqui.</w:t>
+      </w:r>
+    </w:p>
+    <w:p>
+      <w:pPr>
+        <w:pStyle w:val="Heading2"/>
+      </w:pPr>
+      <w:r>
+        <w:t>Neteja anual conducte</w:t>
+      </w:r>
+    </w:p>
+    <w:p>
+      <w:pPr/>
+      <w:r>
+        <w:t>Neteja. Segons l'article 11.5 de l'Ordenanca relativa a la intervencio administrativa municipal en les activitats de Cornella de Llobregat s'ha de justificar el compliment de l'apartat 12 de la norma UNE 123001 on s'especifica el seguent: «Deben llevarse a cabo la limpieza de la chimenea y del conducto de union con periodicidad minima anual». S'ha d'aportar un certificat de neteja.</w:t>
+      </w:r>
+    </w:p>
+    <w:p>
+      <w:pPr>
+        <w:pStyle w:val="Heading2"/>
+      </w:pPr>
+      <w:r>
+        <w:t>Estanqueitat anual conducte</w:t>
+      </w:r>
+    </w:p>
+    <w:p>
+      <w:pPr/>
+      <w:r>
+        <w:t>Estanqueitat. Segons l'article 11.6 de l'Ordenanca relativa a la intervencio administrativa municipal en les activitats de Cornella de Llobregat s'ha de justificar el compliment de l'apartat 12 de la norma UNE 123001 on s'especifica el seguent: «Se debe verificar que se mantienen las condiciones iniciales de estanquidad del sistema, prestando especial atencion a los puntos de union entre los elementos, y al posible deterioro de las juntas de estanquidad, si las hubiera, con periodicidad minima anual». S'ha d'aportar un certificat d'estanqueitat.</w:t>
+      </w:r>
+    </w:p>
+    <w:p>
+      <w:pPr>
+        <w:pStyle w:val="Heading2"/>
+      </w:pPr>
+      <w:r>
+        <w:t>Campana - extincio automatic</w:t>
+      </w:r>
+    </w:p>
+    <w:p>
+      <w:pPr/>
+      <w:r>
+        <w:t>Campana. Segons l'article 11.7 de l'Ordenanca relativa a la intervencio administrativa municipal en les activitats de Cornella de Llobregat s'ha d'instal.lar, i aportar la documentacio corresponent, un sistema d'extincio automatic a la campana d'extraccio de la cuina perque se superen els 20 kW de potencia instal.lada i la cuina no esta considerada un local de risc especial. El sistema s'ha d'instal.lar segons la norma UNE 17446.</w:t>
+      </w:r>
+    </w:p>
+    <w:p>
+      <w:pPr>
+        <w:pStyle w:val="Heading2"/>
+      </w:pPr>
+      <w:r>
+        <w:t>Campana - prohibit filtres carbo</w:t>
+      </w:r>
+    </w:p>
+    <w:p>
+      <w:pPr/>
+      <w:r>
+        <w:t>Campana. Segons l'article 11.9 de l'Ordenanca relativa a la intervencio administrativa municipal en les activitats de Cornella de Llobregat no es permeten solucions tecniques substitutories enfocades a reduir les olors a traves de filtres del carbo actiu o qualsevol sistema que no sigui l'extraccio mecanica. S'ha de retirar qualsevol sistema que no sigui l'extraccio mecanica.</w:t>
+      </w:r>
+    </w:p>
+    <w:p>
+      <w:pPr>
+        <w:pStyle w:val="Heading2"/>
+      </w:pPr>
+      <w:r>
+        <w:t>Campana - ventilador F400 90</w:t>
+      </w:r>
+    </w:p>
+    <w:p>
+      <w:pPr/>
+      <w:r>
+        <w:t>Campana. S'ha de justificar mitjancant documentacio del producte que els ventiladors compleixen amb les especificacions de la norma UNE-EN 12101-3:2016 «Especificacions per a airejadors extractors de fums i calor mecanics» i tenen una classificacio F400 90.</w:t>
+      </w:r>
+    </w:p>
+    <w:p>
+      <w:pPr>
+        <w:pStyle w:val="Heading2"/>
+      </w:pPr>
+      <w:r>
+        <w:t>Elaboracio menjar a domicili</w:t>
+      </w:r>
+    </w:p>
+    <w:p>
+      <w:pPr/>
+      <w:r>
+        <w:t>Elaboracio menjar a domicili. Segons l'article 11.10 de l'Ordenanca relativa a la intervencio administrativa municipal en les activitats de Cornella de Llobregat no es permet l'elaboracio de menjars en domicilis privats per a la seva comercialitzacio.</w:t>
+      </w:r>
+    </w:p>
+    <w:p>
+      <w:pPr>
+        <w:pStyle w:val="Heading1"/>
+      </w:pPr>
+      <w:r>
+        <w:t>Denuncia soroll</w:t>
+      </w:r>
+    </w:p>
+    <w:p>
+      <w:pPr>
+        <w:pStyle w:val="Heading2"/>
+      </w:pPr>
+      <w:r>
+        <w:t>Estudi acustic ajuntament</w:t>
+      </w:r>
+    </w:p>
+    <w:p>
+      <w:pPr/>
+      <w:r>
+        <w:t>Soroll. Es portara a terme un estudi acustic per part de l'ajuntament per comprovar que es compleixen els requisits referents a la contaminacio acustica, de sorolls o vibracions, d'acord amb la normativa d'aplicacio. En cas de resultat desfavorable, el titular haura de fer les mesures pertinents per complir els requisits referents a la contaminacio acustica i posteriorment contractar una Entitat de Control de la Prevencio de la Contaminacio Acustica (EC-PCA) perque ho verifiqui. A criteri de qui faci l'estudi acustic pot demanar al titular de l'activitat activar totes les fonts sonores de l'activitat al maxim rendiment.</w:t>
+      </w:r>
+    </w:p>
+    <w:p>
+      <w:pPr/>
+      <w:r>
+        <w:rPr>
+          <w:sz w:val="20"/>
+        </w:rPr>
+        <w:t>https://www.gencat.cat/mediamb/ohec/epca_CA.pdf</w:t>
+      </w:r>
+    </w:p>
+    <w:p>
+      <w:pPr>
+        <w:pStyle w:val="Heading2"/>
+      </w:pPr>
+      <w:r>
+        <w:t>Acta no acces habitatge</w:t>
+      </w:r>
+    </w:p>
+    <w:p>
+      <w:pPr/>
+      <w:r>
+        <w:t>Soroll. Segons l'article 9.4 de l'Ordenanca relativa a la intervencio administrativa municipal en les activitats de Cornella de Llobregat «El receptor ha de permetre l'acces de l'habitatge per poder realitzar totes les comprovacions i mesuraments necessaris. En cas contrari [CAMP: Organ que aixeca l'acta (la Guardia Urbana / l'EC-PCA)] haura d'aixecar una acta descrivint les fonts sonores del local i explicant el motiu pel qual no s'ha pogut accedir a l'habitatge adjuntant les proves pertinents».</w:t>
+      </w:r>
+    </w:p>
+    <w:p>
+      <w:pPr>
+        <w:pStyle w:val="Heading1"/>
+      </w:pPr>
+      <w:r>
+        <w:t>Denuncia calor</w:t>
+      </w:r>
+    </w:p>
+    <w:p>
+      <w:pPr>
+        <w:pStyle w:val="Heading2"/>
+      </w:pPr>
+      <w:r>
+        <w:t>Aillament focus calor/fred</w:t>
+      </w:r>
+    </w:p>
+    <w:p>
+      <w:pPr/>
+      <w:r>
+        <w:t>Calor. L'activitat incompleix l'article 10 de l'Ordenanca relativa a la intervencio administrativa municipal en les activitats de Cornella de Llobregat. S'ha d'aillar termicament el focus de calor o fred (en aquest cas [CAMP: Focus de calor/fred (p. ex. l'aire condicionat)]) de manera que no pugui produir-se una variacio de temperatura superior a 1 graus C en la superficie exterior de qualsevol dels paraments on esta ubicat, en aquest cas [CAMP: Parament afectat (p. ex. el vei de sobre el focus de calor)].</w:t>
+      </w:r>
+    </w:p>
+    <w:p>
+      <w:pPr>
+        <w:pStyle w:val="Heading1"/>
+      </w:pPr>
+      <w:r>
+        <w:t>Denuncia accessibilitat</w:t>
+      </w:r>
+    </w:p>
+    <w:p>
+      <w:pPr>
+        <w:pStyle w:val="Heading2"/>
+      </w:pPr>
+      <w:r>
+        <w:t>Compliment Codi accessibilitat</w:t>
+      </w:r>
+    </w:p>
+    <w:p>
+      <w:pPr/>
+      <w:r>
+        <w:t>Accessibilitat. S'haura de complir amb aquelles condicions que no es compleixen en la data indicada segons la 2.12. Taula resum de l'Annex 3e del DECRET 209/2023, de 28 de novembre, pel qual s'aprova el Codi d'accessibilitat de Catalunya. Detall: [CAMP: Detall condicions accessibilitat (apartat 2.X de l'annex, terminis, condicions concretes a complir)].</w:t>
+      </w:r>
+    </w:p>
+    <w:p>
+      <w:pPr>
+        <w:pStyle w:val="Heading1"/>
+      </w:pPr>
+      <w:r>
+        <w:t>Denuncia emmagatzematge material exterior</w:t>
+      </w:r>
+    </w:p>
+    <w:p>
+      <w:pPr>
+        <w:pStyle w:val="Heading2"/>
+      </w:pPr>
+      <w:r>
+        <w:t>RSCIEI - distribucio piles (Annex II 2.2)</w:t>
+      </w:r>
+    </w:p>
+    <w:p>
+      <w:pPr/>
+      <w:r>
+        <w:t>Segons l'estipulat en el punt 2.2 de l'Annex II del REGLAMENTO DE SEGURIDAD CONTRA INCENDIOS EN LOS ESTABLECIMIENTOS INDUSTRIALES (RSCIEI), la distribucion de los materiales combustibles en las areas de incendio en configuraciones de tipo D y de tipo E debera cumplir los siguientes requisitos:</w:t>
+      </w:r>
+    </w:p>
+    <w:p>
+      <w:pPr>
+        <w:pStyle w:val="Heading2"/>
+      </w:pPr>
+      <w:r>
+        <w:t>::CHILD:: Pila - superficie max 500 m2</w:t>
+      </w:r>
+    </w:p>
+    <w:p>
+      <w:pPr/>
+      <w:r>
+        <w:t>1er Superficie maxima de cada pila: 500 m2.</w:t>
+      </w:r>
+    </w:p>
+    <w:p>
+      <w:pPr>
+        <w:pStyle w:val="Heading2"/>
+      </w:pPr>
+      <w:r>
+        <w:t>::CHILD:: Pila - volum max 3500 m3</w:t>
+      </w:r>
+    </w:p>
+    <w:p>
+      <w:pPr/>
+      <w:r>
+        <w:t>2on Volumen maximo de cada pila: 3500 m3.</w:t>
+      </w:r>
+    </w:p>
+    <w:p>
+      <w:pPr>
+        <w:pStyle w:val="Heading2"/>
+      </w:pPr>
+      <w:r>
+        <w:t>::CHILD:: Pila - alcada max 15 m</w:t>
+      </w:r>
+    </w:p>
+    <w:p>
+      <w:pPr/>
+      <w:r>
+        <w:t>3er Altura maxima de cada pila: 15 m.</w:t>
+      </w:r>
+    </w:p>
+    <w:p>
+      <w:pPr>
+        <w:pStyle w:val="Heading2"/>
+      </w:pPr>
+      <w:r>
+        <w:t>::CHILD:: Pila - longitud segons passadis</w:t>
+      </w:r>
+    </w:p>
+    <w:p>
+      <w:pPr/>
+      <w:r>
+        <w:t>4t Longitud maxima de cada pila: 45 m si el pasillo entre pilas es &gt;= 2,5 m; 20 m si el pasillo entre pilas es &gt;= 1,5 m.</w:t>
+      </w:r>
+    </w:p>
+    <w:p>
+      <w:pPr>
+        <w:pStyle w:val="Heading2"/>
+      </w:pPr>
+      <w:r>
+        <w:t>RSCIEI - evacuacio i senyalitzacio (Annex II 6.5)</w:t>
+      </w:r>
+    </w:p>
+    <w:p>
+      <w:pPr/>
+      <w:r>
+        <w:t>Segons l'estipulat en el punt 6.5 de l'Annex II del RSCIEI, las disposiciones en materia de evacuacion y senalizacion en los establecimientos industriales que esten ubicados en configuraciones de tipo D y E cumpliran los requisitos siguientes:</w:t>
+      </w:r>
+    </w:p>
+    <w:p>
+      <w:pPr>
+        <w:pStyle w:val="Heading2"/>
+      </w:pPr>
+      <w:r>
+        <w:t>::CHILD:: Franja perimetral</w:t>
+      </w:r>
+    </w:p>
+    <w:p>
+      <w:pPr/>
+      <w:r>
+        <w:t>Anchura de la franja perimetral: la altura de la pila y como minimo 5 m.</w:t>
+      </w:r>
+    </w:p>
+    <w:p>
+      <w:pPr>
+        <w:pStyle w:val="Heading2"/>
+      </w:pPr>
+      <w:r>
+        <w:t>::CHILD:: Camins emergencia - amplada</w:t>
+      </w:r>
+    </w:p>
+    <w:p>
+      <w:pPr/>
+      <w:r>
+        <w:t>Anchura para caminos de acceso de emergencia: 4,5 m.</w:t>
+      </w:r>
+    </w:p>
+    <w:p>
+      <w:pPr>
+        <w:pStyle w:val="Heading2"/>
+      </w:pPr>
+      <w:r>
+        <w:t>::CHILD:: Camins emergencia - separacio</w:t>
+      </w:r>
+    </w:p>
+    <w:p>
+      <w:pPr/>
+      <w:r>
+        <w:t>Separacion maxima entre caminos de emergencia: 65 m.</w:t>
+      </w:r>
+    </w:p>
+    <w:p>
+      <w:pPr>
+        <w:pStyle w:val="Heading2"/>
+      </w:pPr>
+      <w:r>
+        <w:t>::CHILD:: Passadissos entre piles - amplada</w:t>
+      </w:r>
+    </w:p>
+    <w:p>
+      <w:pPr/>
+      <w:r>
+        <w:t>Anchura minima de pasillos entre pilas: 1,5 m.</w:t>
+      </w:r>
+    </w:p>
+    <w:p>
+      <w:pPr>
+        <w:pStyle w:val="Heading1"/>
+      </w:pPr>
+      <w:r>
+        <w:t>Documentacio / Retols</w:t>
+      </w:r>
+    </w:p>
+    <w:p>
+      <w:pPr>
+        <w:pStyle w:val="Heading2"/>
+      </w:pPr>
+      <w:r>
+        <w:t>Documentacio a presentar</w:t>
+      </w:r>
+    </w:p>
+    <w:p>
+      <w:pPr/>
+      <w:r>
+        <w:t>S'ha de presentar la seguent documentacio:</w:t>
+      </w:r>
+    </w:p>
+    <w:p>
+      <w:pPr>
+        <w:pStyle w:val="Heading2"/>
+      </w:pPr>
+      <w:r>
+        <w:t>::CHILD:: Doc - canvi titularitat activitat</w:t>
+      </w:r>
+    </w:p>
+    <w:p>
+      <w:pPr/>
+      <w:r>
+        <w:t>El canvi de titularitat de l'activitat a l'actual titular.</w:t>
+      </w:r>
+    </w:p>
+    <w:p>
+      <w:pPr>
+        <w:pStyle w:val="Heading2"/>
+      </w:pPr>
+      <w:r>
+        <w:t>::CHILD:: Doc - canvi titularitat autoritzacio</w:t>
+      </w:r>
+    </w:p>
+    <w:p>
+      <w:pPr/>
+      <w:r>
+        <w:t>El canvi de titularitat de l'autoritzacio [CAMP: Autoritzacio canvi titularitat (especificar)] a l'actual titular.</w:t>
+      </w:r>
+    </w:p>
+    <w:p>
+      <w:pPr>
+        <w:pStyle w:val="Heading2"/>
+      </w:pPr>
+      <w:r>
+        <w:t>::CHILD:: Doc - planol(s) plantes</w:t>
+      </w:r>
+    </w:p>
+    <w:p>
+      <w:pPr/>
+      <w:r>
+        <w:t>El(s) planol(s) de les plantes ocupades per l'activitat a escala normalitzada amb el detall de: la maquinaria instal.lada, els recorreguts d'evacuacio i senyalitzacio dels corresponents, els equips i instal.lacions contra incendis, el compliment d'accessibilitat, resta de detalls que es considerin necessaris per explicar el compliment de requisits segons la normativa d'aplicacio corresponent.</w:t>
+      </w:r>
+    </w:p>
+    <w:p>
+      <w:pPr>
+        <w:pStyle w:val="Heading2"/>
+      </w:pPr>
+      <w:r>
+        <w:t>::CHILD:: Doc - alta IAE</w:t>
+      </w:r>
+    </w:p>
+    <w:p>
+      <w:pPr/>
+      <w:r>
+        <w:t>L'alta a l'IAE on s'observi l'adreca de l'activitat.</w:t>
+      </w:r>
+    </w:p>
+    <w:p>
+      <w:pPr>
+        <w:pStyle w:val="Heading2"/>
+      </w:pPr>
+      <w:r>
+        <w:t>::CHILD:: Doc - factura electrica</w:t>
+      </w:r>
+    </w:p>
+    <w:p>
+      <w:pPr/>
+      <w:r>
+        <w:t>La factura electrica a nom del titular.</w:t>
+      </w:r>
+    </w:p>
+    <w:p>
+      <w:pPr>
+        <w:pStyle w:val="Heading2"/>
+      </w:pPr>
+      <w:r>
+        <w:t>::CHILD:: Doc - factura aigua</w:t>
+      </w:r>
+    </w:p>
+    <w:p>
+      <w:pPr/>
+      <w:r>
+        <w:t>La factura d'aigua a nom del titular.</w:t>
+      </w:r>
+    </w:p>
+    <w:p>
+      <w:pPr>
+        <w:pStyle w:val="Heading2"/>
+      </w:pPr>
+      <w:r>
+        <w:t>::CHILD:: Doc - fulls de reclamacio</w:t>
+      </w:r>
+    </w:p>
+    <w:p>
+      <w:pPr/>
+      <w:r>
+        <w:t>Fulls de reclamacio impresos.</w:t>
+      </w:r>
+    </w:p>
+    <w:p>
+      <w:pPr>
+        <w:pStyle w:val="Heading2"/>
+      </w:pPr>
+      <w:r>
+        <w:t>::CHILD:: Doc - contracte gestio olis</w:t>
+      </w:r>
+    </w:p>
+    <w:p>
+      <w:pPr/>
+      <w:r>
+        <w:t>El contracte de gestio d'olis de la cuina.</w:t>
+      </w:r>
+    </w:p>
+    <w:p>
+      <w:pPr>
+        <w:pStyle w:val="Heading2"/>
+      </w:pPr>
+      <w:r>
+        <w:t>::CHILD:: Doc - control de plagues</w:t>
+      </w:r>
+    </w:p>
+    <w:p>
+      <w:pPr/>
+      <w:r>
+        <w:t>El certificat de control de plagues.</w:t>
+      </w:r>
+    </w:p>
+    <w:p>
+      <w:pPr>
+        <w:pStyle w:val="Heading2"/>
+      </w:pPr>
+      <w:r>
+        <w:t>::CHILD:: Doc - formacio aliments (4 anys)</w:t>
+      </w:r>
+    </w:p>
+    <w:p>
+      <w:pPr/>
+      <w:r>
+        <w:t>El certificat de formacio d'aliments de tots i cadascun dels treballadors de l'establiment (vigencia 4 anys).</w:t>
+      </w:r>
+    </w:p>
+    <w:p>
+      <w:pPr>
+        <w:pStyle w:val="Heading2"/>
+      </w:pPr>
+      <w:r>
+        <w:t>::CHILD:: Doc - assegurança RC</w:t>
+      </w:r>
+    </w:p>
+    <w:p>
+      <w:pPr/>
+      <w:r>
+        <w:t>Presentar l'assegurança de Responsabilitat Civil, amb la quantitat de capital assegurat seguent: fins a 100 persones d'aforament autoritzat: 300.000 EUR; fins a 150: 400.000 EUR; fins a 300: 600.000 EUR; fins a 500: 750.000 EUR; fins a 1.000: 900.000 EUR; fins a 1.500: 1.200.000 EUR; fins a 2.500: 1.600.000 EUR; fins a 5.000: 2.000.000 EUR.</w:t>
+      </w:r>
+    </w:p>
+    <w:p>
+      <w:pPr>
+        <w:pStyle w:val="Heading2"/>
+      </w:pPr>
+      <w:r>
+        <w:t>::CHILD:: Doc - rebut assegurança RC</w:t>
+      </w:r>
+    </w:p>
+    <w:p>
+      <w:pPr/>
+      <w:r>
+        <w:t>El rebut de pagament de l'assegurança de Responsabilitat Civil.</w:t>
+      </w:r>
+    </w:p>
+    <w:p>
+      <w:pPr>
+        <w:pStyle w:val="Heading2"/>
+      </w:pPr>
+      <w:r>
+        <w:t>Retols exterior - general</w:t>
+      </w:r>
+    </w:p>
+    <w:p>
+      <w:pPr/>
+      <w:r>
+        <w:t>Manquen els seguents retols a l'exterior de l'establiment, minim en catala:</w:t>
+      </w:r>
+    </w:p>
+    <w:p>
+      <w:pPr>
+        <w:pStyle w:val="Heading2"/>
+      </w:pPr>
+      <w:r>
+        <w:t>::CHILD:: Retol - nom comercial</w:t>
+      </w:r>
+    </w:p>
+    <w:p>
+      <w:pPr/>
+      <w:r>
+        <w:t>El nom comercial de l'activitat.</w:t>
+      </w:r>
+    </w:p>
+    <w:p>
+      <w:pPr>
+        <w:pStyle w:val="Heading2"/>
+      </w:pPr>
+      <w:r>
+        <w:t>::CHILD:: Retol - horari obertura/tancament</w:t>
+      </w:r>
+    </w:p>
+    <w:p>
+      <w:pPr/>
+      <w:r>
+        <w:t>L'horari d'obertura i tancament, que es pugui veure clarament inclus si l'activitat esta tancada.</w:t>
+      </w:r>
+    </w:p>
+    <w:p>
+      <w:pPr>
+        <w:pStyle w:val="Heading2"/>
+      </w:pPr>
+      <w:r>
+        <w:t>::CHILD:: Retol - aforament autoritzat</w:t>
+      </w:r>
+    </w:p>
+    <w:p>
+      <w:pPr/>
+      <w:r>
+        <w:t>Aforament autoritzat.</w:t>
+      </w:r>
+    </w:p>
+    <w:p>
+      <w:pPr>
+        <w:pStyle w:val="Heading2"/>
+      </w:pPr>
+      <w:r>
+        <w:t>::CHILD:: Retol - prohibit fumar</w:t>
+      </w:r>
+    </w:p>
+    <w:p>
+      <w:pPr/>
+      <w:r>
+        <w:t>Prohibit fumar.</w:t>
+      </w:r>
+    </w:p>
+    <w:p>
+      <w:pPr>
+        <w:pStyle w:val="Heading2"/>
+      </w:pPr>
+      <w:r>
+        <w:t>::CHILD:: Retol - llistat de preus</w:t>
+      </w:r>
+    </w:p>
+    <w:p>
+      <w:pPr/>
+      <w:r>
+        <w:t>Llistat de preus.</w:t>
+      </w:r>
+    </w:p>
+    <w:p>
+      <w:pPr>
+        <w:pStyle w:val="Heading2"/>
+      </w:pPr>
+      <w:r>
+        <w:t>::CHILD:: Retol - us camaras seguretat</w:t>
+      </w:r>
+    </w:p>
+    <w:p>
+      <w:pPr/>
+      <w:r>
+        <w:t>Informacio us de cameres de seguretat.</w:t>
+      </w:r>
+    </w:p>
+    <w:p>
+      <w:pPr>
+        <w:pStyle w:val="Heading2"/>
+      </w:pPr>
+      <w:r>
+        <w:t>Retols exterior - addicionals</w:t>
+      </w:r>
+    </w:p>
+    <w:p>
+      <w:pPr/>
+      <w:r>
+        <w:t>Manquen els seguents retols a l'exterior de l'establiment, minim en catala:</w:t>
+      </w:r>
+    </w:p>
+    <w:p>
+      <w:pPr>
+        <w:pStyle w:val="Heading2"/>
+      </w:pPr>
+      <w:r>
+        <w:t>::CHILD:: Retol - alcohol menors</w:t>
+      </w:r>
+    </w:p>
+    <w:p>
+      <w:pPr/>
+      <w:r>
+        <w:t>Prohibicio venda d'alcohol a menors d'edat.</w:t>
+      </w:r>
+    </w:p>
+    <w:p>
+      <w:pPr>
+        <w:pStyle w:val="Heading2"/>
+      </w:pPr>
+      <w:r>
+        <w:t>::CHILD:: Retol - tabac menors</w:t>
+      </w:r>
+    </w:p>
+    <w:p>
+      <w:pPr/>
+      <w:r>
+        <w:t>Prohibicio venda tabac a menors d'edat.</w:t>
+      </w:r>
+    </w:p>
+    <w:p>
+      <w:pPr>
+        <w:pStyle w:val="Heading2"/>
+      </w:pPr>
+      <w:r>
+        <w:t>::CHILD:: Retol - maquines recreatives menors</w:t>
+      </w:r>
+    </w:p>
+    <w:p>
+      <w:pPr/>
+      <w:r>
+        <w:t>Prohibicio de l'us de maquines recreatives i d'atzar a menors d'edat.</w:t>
+      </w:r>
+    </w:p>
+    <w:p>
+      <w:pPr>
+        <w:pStyle w:val="Heading2"/>
+      </w:pPr>
+      <w:r>
+        <w:t>::CHILD:: Retol - fulls de reclamacio</w:t>
+      </w:r>
+    </w:p>
+    <w:p>
+      <w:pPr/>
+      <w:r>
+        <w:t>Es disposa de fulls de reclamacio.</w:t>
+      </w:r>
+    </w:p>
+    <w:p>
+      <w:pPr>
+        <w:pStyle w:val="Heading2"/>
+      </w:pPr>
+      <w:r>
+        <w:t>::CHILD:: Retol - recorreguts emergencia</w:t>
+      </w:r>
+    </w:p>
+    <w:p>
+      <w:pPr/>
+      <w:r>
+        <w:t>Els recorreguts d'emergencia segons el CTE DB SI 3 Apartat 7.</w:t>
+      </w:r>
+    </w:p>
+    <w:p>
+      <w:pPr>
+        <w:pStyle w:val="Heading2"/>
+      </w:pPr>
+      <w:r>
+        <w:t>::CHILD:: Retol - SORTIDA</w:t>
+      </w:r>
+    </w:p>
+    <w:p>
+      <w:pPr/>
+      <w:r>
+        <w:t>La sortida de l'establiment on s'indiqui «SORTIDA».</w:t>
+      </w:r>
+    </w:p>
+    <w:p>
+      <w:pPr>
+        <w:pStyle w:val="Heading1"/>
+      </w:pPr>
+      <w:r>
+        <w:t>Accessibilitat</w:t>
+      </w:r>
+    </w:p>
+    <w:p>
+      <w:pPr>
+        <w:pStyle w:val="Heading2"/>
+      </w:pPr>
+      <w:r>
+        <w:t>Espai treballadors - amplada portes/passadissos</w:t>
+      </w:r>
+    </w:p>
+    <w:p>
+      <w:pPr/>
+      <w:r>
+        <w:t>Espai treballadors. No es compleix amb l'article 5.3o de l'Annex I.A del Real Decreto 486/1997, de 14 de abril, por el que se establecen las disposiciones minimas de seguridad y salud en los lugares de trabajo: «La anchura minima de las puertas exteriores y de los pasillos sera de 80 centimetros y 1 metro, respectivamente». S'ha de redistribuir l'espai de [CAMP: Espai a redistribuir (p. ex. la cuina)].</w:t>
+      </w:r>
+    </w:p>
+    <w:p>
+      <w:pPr>
+        <w:pStyle w:val="Heading2"/>
+      </w:pPr>
+      <w:r>
+        <w:t>Acces - apartat 2 annex 3d</w:t>
+      </w:r>
+    </w:p>
+    <w:p>
+      <w:pPr/>
+      <w:r>
+        <w:t>Acces. S'ha de justificar el compliment de l'apartat 2 de l'Annex 3d del DECRET 209/2023, de 28 de novembre, pel qual s'aprova el Codi d'accessibilitat de Catalunya. Condicions que s'han de complir segons la Taula 2. [CAMP: Condicions taula 2 - acces (X.X: XXX (segons l'apartat X.X de l'annex XX))].</w:t>
+      </w:r>
+    </w:p>
+    <w:p>
+      <w:pPr>
+        <w:pStyle w:val="Heading2"/>
+      </w:pPr>
+      <w:r>
+        <w:t>Itineraris interiors - apartat 3 annex 3d</w:t>
+      </w:r>
+    </w:p>
+    <w:p>
+      <w:pPr/>
+      <w:r>
+        <w:t>Itineraris interiors. S'ha de justificar el compliment de l'apartat 3 de l'Annex 3d del DECRET 209/2023, de 28 de novembre, pel qual s'aprova el Codi d'accessibilitat de Catalunya.</w:t>
+      </w:r>
+    </w:p>
+    <w:p>
+      <w:pPr>
+        <w:pStyle w:val="Heading2"/>
+      </w:pPr>
+      <w:r>
+        <w:t>Cambres higieniques - apartat 4 annex 3d</w:t>
+      </w:r>
+    </w:p>
+    <w:p>
+      <w:pPr/>
+      <w:r>
+        <w:t>Cambres higieniques. S'ha de justificar el compliment de l'apartat 4 de l'Annex 3d del DECRET 209/2023, de 28 de novembre, pel qual s'aprova el Codi d'accessibilitat de Catalunya. Condicions que s'han de complir segons la Taula 4. [CAMP: Condicions taula 4 - cambres higieniques (X: XXX (segons l'apartat X.X de l'annex XX))].</w:t>
+      </w:r>
+    </w:p>
+    <w:p>
+      <w:pPr>
+        <w:pStyle w:val="Heading2"/>
+      </w:pPr>
+      <w:r>
+        <w:t>Lavabos categoria local</w:t>
+      </w:r>
+    </w:p>
+    <w:p>
+      <w:pPr/>
+      <w:r>
+        <w:t>S'ha de comprovar en el nou projecte que hi ha els lavabos corresponents segons la categoria del local comercial i que l'acces esta correctament adaptat.</w:t>
+      </w:r>
+    </w:p>
+    <w:p>
+      <w:pPr>
+        <w:pStyle w:val="Heading2"/>
+      </w:pPr>
+      <w:r>
+        <w:t>Nou projecte modificacions</w:t>
+      </w:r>
+    </w:p>
+    <w:p>
+      <w:pPr/>
+      <w:r>
+        <w:t>S'haura d'entregar a l'Ajuntament un nou projecte on es puguin observar les modificacions per esmenar les deficiencies d'aquest informe.</w:t>
       </w:r>
     </w:p>
     <w:sectPr>

</xml_diff>

<commit_message>
REQ1: actualitza dos enllacos caiguts i mou el comprovador a suport/
Enllacos caiguts detectats amb ComprovarEnllacos.bat, actualitzats a REQ1.docx:
- Sanitat: salutweb.gencat.cat -> tramits.gencat.cat
  (Autoritzacio-de-centres-o-serveis-sanitaris)
- Instal·lacio de gas (Verificacio per unitat): empresa.gencat.cat/...
  /gasos-combustibles/verificacio/ -> canalempresa.gencat.cat/.../
  Presentacio-de-la-declaracio-responsable-...-gasos-combustibles-...?category=

A mes, es mou ComprovarEnllacos.bat de l'arrel a suport/ (al costat del .ps1),
com Instalar.bat. Docs (README, ESTRUCTURA) actualitzades.

Co-Authored-By: Claude Opus 4.8 <noreply@anthropic.com>
Claude-Session: https://claude.ai/code/session_01JMJrmChJ5HaLxF2Q9xTa1S
</commit_message>
<xml_diff>
--- a/ESTRUCTURALS/REQ1.docx
+++ b/ESTRUCTURALS/REQ1.docx
@@ -41,7 +41,7 @@
         <w:pStyle w:val="Cita"/>
       </w:pPr>
       <w:r>
-        <w:t>https://salutweb.gencat.cat/ca/tramits/tramits-temes/Autoritzacio-de-centres-o-serveis-sanitaris</w:t>
+        <w:t>https://tramits.gencat.cat/ca/tramits/tramits-temes/Autoritzacio-de-centres-o-serveis-sanitaris</w:t>
       </w:r>
     </w:p>
     <w:p>
@@ -1405,7 +1405,7 @@
         <w:pStyle w:val="Cita"/>
       </w:pPr>
       <w:r>
-        <w:t>https://empresa.gencat.cat/ca/treb_ambits_actuacio/seguretat-industrial/installacions-industrials/gasos-combustibles/verificacio/</w:t>
+        <w:t>https://canalempresa.gencat.cat/ca/integraciodepartamentaltramit/tramit/PerTemes/Presentacio-de-la-declaracio-responsable-per-a-installacions-de-gasos-combustibles-posada-en-servei-modificacions-i-baixa?category=</w:t>
       </w:r>
     </w:p>
     <w:p>

</xml_diff>

<commit_message>
Corporatització (escut a totes les finestres), min/max/tancar, CHILD com a bullet, REQ1, velocitat
Sobre la feina ACT_EXTR ja fusionada a main:
- Totes les finestres de l'app (GenerarInforme, Seguiment, ACT_EXTR) es poden
  MINIMITZAR, MAXIMITZAR i tancar; helper _NewForm comú (abans FixedDialog).
- Escut de Cornellà (cornella.ico) al títol de totes les finestres i a la
  miniatura de la barra de tasques.
- CHILD (::CHILD::) s'emeten com a PUNT DE LLISTA reutilitzant Format-Bullet
  (-IsChild), en lloc de text indentat pla.
- REQ1.docx: eliminat el ::INTRO:: amb la URL QUADRE_Salut_Alimentaria.pdf.
- Velocitat: generar informes ja NO comprova/actualitza la base al Drive (això
  només amb Actualitzar.bat), així el Pas 2 no depèn de la xarxa.

Co-Authored-By: Claude Opus 4.8 <noreply@anthropic.com>
Claude-Session: https://claude.ai/code/session_01WMBQRSm57ZkewSaXCufeX3
</commit_message>
<xml_diff>
--- a/ESTRUCTURALS/REQ1.docx
+++ b/ESTRUCTURALS/REQ1.docx
@@ -1,6 +1,6 @@
 
 <file path=word/document.xml><?xml version="1.0" encoding="utf-8"?>
-<w:document xmlns:wpc="http://schemas.microsoft.com/office/word/2010/wordprocessingCanvas" xmlns:cx="http://schemas.microsoft.com/office/drawing/2014/chartex" xmlns:cx1="http://schemas.microsoft.com/office/drawing/2015/9/8/chartex" xmlns:mc="http://schemas.openxmlformats.org/markup-compatibility/2006" xmlns:o="urn:schemas-microsoft-com:office:office" xmlns:r="http://schemas.openxmlformats.org/officeDocument/2006/relationships" xmlns:m="http://schemas.openxmlformats.org/officeDocument/2006/math" xmlns:v="urn:schemas-microsoft-com:vml" xmlns:wp14="http://schemas.microsoft.com/office/word/2010/wordprocessingDrawing" xmlns:wp="http://schemas.openxmlformats.org/drawingml/2006/wordprocessingDrawing" xmlns:w10="urn:schemas-microsoft-com:office:word" xmlns:w="http://schemas.openxmlformats.org/wordprocessingml/2006/main" xmlns:w14="http://schemas.microsoft.com/office/word/2010/wordml" xmlns:w15="http://schemas.microsoft.com/office/word/2012/wordml" xmlns:w16se="http://schemas.microsoft.com/office/word/2015/wordml/symex" xmlns:wpg="http://schemas.microsoft.com/office/word/2010/wordprocessingGroup" xmlns:wpi="http://schemas.microsoft.com/office/word/2010/wordprocessingInk" xmlns:wne="http://schemas.microsoft.com/office/word/2006/wordml" xmlns:wps="http://schemas.microsoft.com/office/word/2010/wordprocessingShape" mc:Ignorable="w14 w15 w16se wp14">
+<w:document xmlns:mc="http://schemas.openxmlformats.org/markup-compatibility/2006" xmlns:r="http://schemas.openxmlformats.org/officeDocument/2006/relationships" xmlns:w="http://schemas.openxmlformats.org/wordprocessingml/2006/main" mc:Ignorable="w14 w15 w16se wp14">
   <w:body>
     <w:p>
       <w:r>
@@ -4177,19 +4177,6 @@
       </w:pPr>
       <w:r>
         <w:t>::SUB:: Registres sanitaris</w:t>
-      </w:r>
-    </w:p>
-    <w:p>
-      <w:pPr>
-        <w:pStyle w:val="Ttulo2"/>
-      </w:pPr>
-      <w:r>
-        <w:t>::INTRO::</w:t>
-      </w:r>
-    </w:p>
-    <w:p>
-      <w:r>
-        <w:t>https://canalempresa.gencat.cat/web/.content/oge/doc/QUADRE_Salut_Alimentaria.pdf</w:t>
       </w:r>
     </w:p>
     <w:p>

</xml_diff>